<commit_message>
copied some additions from secondary phone
</commit_message>
<xml_diff>
--- a/bok/BOKRD5.docx
+++ b/bok/BOKRD5.docx
@@ -1,6 +1,6 @@
 
 <file path=word/document.xml><?xml version="1.0" encoding="utf-8"?>
-<w:document xmlns:o="urn:schemas-microsoft-com:office:office" xmlns:r="http://schemas.openxmlformats.org/officeDocument/2006/relationships" xmlns:v="urn:schemas-microsoft-com:vml" xmlns:w="http://schemas.openxmlformats.org/wordprocessingml/2006/main" xmlns:w10="urn:schemas-microsoft-com:office:word" xmlns:wp="http://schemas.openxmlformats.org/drawingml/2006/wordprocessingDrawing" xmlns:wps="http://schemas.microsoft.com/office/word/2010/wordprocessingShape" xmlns:wpg="http://schemas.microsoft.com/office/word/2010/wordprocessingGroup" xmlns:mc="http://schemas.openxmlformats.org/markup-compatibility/2006" xmlns:wp14="http://schemas.microsoft.com/office/word/2010/wordprocessingDrawing" xmlns:w14="http://schemas.microsoft.com/office/word/2010/wordml" mc:Ignorable="w14 wp14">
+<w:document xmlns:o="urn:schemas-microsoft-com:office:office" xmlns:r="http://schemas.openxmlformats.org/officeDocument/2006/relationships" xmlns:v="urn:schemas-microsoft-com:vml" xmlns:w="http://schemas.openxmlformats.org/wordprocessingml/2006/main" xmlns:w10="urn:schemas-microsoft-com:office:word" xmlns:wp="http://schemas.openxmlformats.org/drawingml/2006/wordprocessingDrawing" xmlns:pic="http://schemas.openxmlformats.org/drawingml/2006/picture" xmlns:wps="http://schemas.microsoft.com/office/word/2010/wordprocessingShape" xmlns:wpg="http://schemas.microsoft.com/office/word/2010/wordprocessingGroup" xmlns:mc="http://schemas.openxmlformats.org/markup-compatibility/2006" xmlns:wp14="http://schemas.microsoft.com/office/word/2010/wordprocessingDrawing" xmlns:w14="http://schemas.microsoft.com/office/word/2010/wordml" xmlns:w15="http://schemas.microsoft.com/office/word/2012/wordml" mc:Ignorable="w14 wp14 w15">
   <w:body>
     <w:p>
       <w:pPr>
@@ -68,7 +68,6 @@
         <w:rPr>
           <w:rFonts w:ascii="Times New Roman" w:hAnsi="Times New Roman"/>
           <w:b w:val="false"/>
-          <w:b w:val="false"/>
           <w:bCs w:val="false"/>
           <w:outline w:val="false"/>
           <w:color w:val="auto"/>
@@ -86,7 +85,7 @@
           <w:b w:val="false"/>
           <w:bCs w:val="false"/>
           <w:outline w:val="false"/>
-          <w:color w:val="000000"/>
+          <w:color w:val="auto"/>
           <w:spacing w:val="0"/>
           <w:kern w:val="0"/>
           <w:sz w:val="24"/>
@@ -198,7 +197,6 @@
         <w:rPr>
           <w:rFonts w:ascii="Times New Roman" w:hAnsi="Times New Roman"/>
           <w:b w:val="false"/>
-          <w:b w:val="false"/>
           <w:bCs w:val="false"/>
           <w:color w:val="auto"/>
           <w:sz w:val="24"/>
@@ -211,7 +209,7 @@
           <w:rFonts w:ascii="Times New Roman" w:hAnsi="Times New Roman"/>
           <w:b w:val="false"/>
           <w:bCs w:val="false"/>
-          <w:color w:val="000000"/>
+          <w:color w:val="auto"/>
           <w:sz w:val="24"/>
           <w:szCs w:val="24"/>
           <w:shd w:fill="auto" w:val="clear"/>
@@ -385,7 +383,6 @@
         <w:rPr>
           <w:rFonts w:ascii="Times New Roman" w:hAnsi="Times New Roman"/>
           <w:b w:val="false"/>
-          <w:b w:val="false"/>
           <w:bCs w:val="false"/>
           <w:color w:val="auto"/>
           <w:sz w:val="24"/>
@@ -399,7 +396,7 @@
           <w:rFonts w:ascii="Times New Roman" w:hAnsi="Times New Roman"/>
           <w:b w:val="false"/>
           <w:bCs w:val="false"/>
-          <w:color w:val="000000"/>
+          <w:color w:val="auto"/>
           <w:sz w:val="24"/>
           <w:szCs w:val="24"/>
           <w:u w:val="none"/>
@@ -535,7 +532,6 @@
         <w:rPr>
           <w:rFonts w:eastAsia="Songti SC" w:cs="Arial Unicode MS"/>
           <w:b w:val="false"/>
-          <w:b w:val="false"/>
           <w:bCs w:val="false"/>
           <w:outline w:val="false"/>
           <w:color w:val="000000"/>
@@ -621,7 +617,6 @@
         <w:rPr>
           <w:rFonts w:ascii="Times New Roman" w:hAnsi="Times New Roman"/>
           <w:b w:val="false"/>
-          <w:b w:val="false"/>
           <w:bCs w:val="false"/>
           <w:color w:val="auto"/>
           <w:sz w:val="24"/>
@@ -635,7 +630,7 @@
           <w:rFonts w:ascii="Times New Roman" w:hAnsi="Times New Roman"/>
           <w:b w:val="false"/>
           <w:bCs w:val="false"/>
-          <w:color w:val="000000"/>
+          <w:color w:val="auto"/>
           <w:sz w:val="24"/>
           <w:szCs w:val="24"/>
           <w:u w:val="none"/>
@@ -754,7 +749,6 @@
         <w:rPr>
           <w:rFonts w:ascii="Times New Roman" w:hAnsi="Times New Roman"/>
           <w:b w:val="false"/>
-          <w:b w:val="false"/>
           <w:bCs w:val="false"/>
           <w:color w:val="auto"/>
           <w:sz w:val="24"/>
@@ -767,7 +761,7 @@
           <w:rFonts w:ascii="Times New Roman" w:hAnsi="Times New Roman"/>
           <w:b w:val="false"/>
           <w:bCs w:val="false"/>
-          <w:color w:val="000000"/>
+          <w:color w:val="auto"/>
           <w:sz w:val="24"/>
           <w:szCs w:val="24"/>
           <w:shd w:fill="auto" w:val="clear"/>
@@ -1136,7 +1130,6 @@
         <w:rPr>
           <w:rFonts w:ascii="Times New Roman" w:hAnsi="Times New Roman"/>
           <w:b w:val="false"/>
-          <w:b w:val="false"/>
           <w:bCs w:val="false"/>
           <w:color w:val="auto"/>
           <w:sz w:val="24"/>
@@ -1149,7 +1142,7 @@
           <w:rFonts w:ascii="Times New Roman" w:hAnsi="Times New Roman"/>
           <w:b w:val="false"/>
           <w:bCs w:val="false"/>
-          <w:color w:val="000000"/>
+          <w:color w:val="auto"/>
           <w:sz w:val="24"/>
           <w:szCs w:val="24"/>
           <w:shd w:fill="auto" w:val="clear"/>
@@ -1324,7 +1317,6 @@
         <w:rPr>
           <w:rFonts w:ascii="Times New Roman" w:hAnsi="Times New Roman"/>
           <w:b w:val="false"/>
-          <w:b w:val="false"/>
           <w:bCs w:val="false"/>
           <w:outline w:val="false"/>
           <w:color w:val="auto"/>
@@ -1342,7 +1334,7 @@
           <w:b w:val="false"/>
           <w:bCs w:val="false"/>
           <w:outline w:val="false"/>
-          <w:color w:val="000000"/>
+          <w:color w:val="auto"/>
           <w:spacing w:val="0"/>
           <w:kern w:val="0"/>
           <w:sz w:val="24"/>
@@ -1451,75 +1443,7 @@
           <w:shd w:fill="auto" w:val="clear"/>
           <w:lang w:val="en-US" w:eastAsia="zh-CN" w:bidi="hi-IN"/>
         </w:rPr>
-        <w:t xml:space="preserve">Accurately assess the importance of your actions. Hone your awarenesses(spatial, situational, etc).??? Before taking </w:t>
-      </w:r>
-      <w:r>
-        <w:rPr>
-          <w:rFonts w:eastAsia="Songti SC" w:cs="Arial Unicode MS" w:ascii="Times New Roman" w:hAnsi="Times New Roman"/>
-          <w:b w:val="false"/>
-          <w:bCs w:val="false"/>
-          <w:outline w:val="false"/>
-          <w:color w:val="000000"/>
-          <w:spacing w:val="0"/>
-          <w:kern w:val="0"/>
-          <w:sz w:val="24"/>
-          <w:szCs w:val="24"/>
-          <w:u w:val="none"/>
-          <w:shd w:fill="auto" w:val="clear"/>
-          <w:lang w:val="en-US" w:eastAsia="zh-CN" w:bidi="hi-IN"/>
-        </w:rPr>
-        <w:t>any</w:t>
-      </w:r>
-      <w:r>
-        <w:rPr>
-          <w:rFonts w:eastAsia="Songti SC" w:cs="Arial Unicode MS" w:ascii="Times New Roman" w:hAnsi="Times New Roman"/>
-          <w:b w:val="false"/>
-          <w:bCs w:val="false"/>
-          <w:outline w:val="false"/>
-          <w:color w:val="000000"/>
-          <w:spacing w:val="0"/>
-          <w:kern w:val="0"/>
-          <w:sz w:val="24"/>
-          <w:szCs w:val="24"/>
-          <w:u w:val="none"/>
-          <w:shd w:fill="auto" w:val="clear"/>
-          <w:lang w:val="en-US" w:eastAsia="zh-CN" w:bidi="hi-IN"/>
-        </w:rPr>
-        <w:t xml:space="preserve"> action consider the intended and unintended consequences. </w:t>
-      </w:r>
-      <w:r>
-        <w:rPr>
-          <w:rFonts w:eastAsia="Songti SC" w:cs="Arial Unicode MS" w:ascii="Times New Roman" w:hAnsi="Times New Roman"/>
-          <w:b w:val="false"/>
-          <w:bCs w:val="false"/>
-          <w:outline w:val="false"/>
-          <w:color w:val="000000"/>
-          <w:spacing w:val="0"/>
-          <w:kern w:val="0"/>
-          <w:sz w:val="24"/>
-          <w:szCs w:val="24"/>
-          <w:u w:val="none"/>
-          <w:shd w:fill="auto" w:val="clear"/>
-          <w:lang w:val="en-US" w:eastAsia="zh-CN" w:bidi="hi-IN"/>
-        </w:rPr>
-        <w:t>Consider everything.</w:t>
-      </w:r>
-      <w:r>
-        <w:rPr>
-          <w:rFonts w:eastAsia="Songti SC" w:cs="Arial Unicode MS" w:ascii="Times New Roman" w:hAnsi="Times New Roman"/>
-          <w:b w:val="false"/>
-          <w:bCs w:val="false"/>
-          <w:outline w:val="false"/>
-          <w:color w:val="000000"/>
-          <w:spacing w:val="0"/>
-          <w:kern w:val="0"/>
-          <w:sz w:val="24"/>
-          <w:szCs w:val="24"/>
-          <w:u w:val="none"/>
-          <w:shd w:fill="auto" w:val="clear"/>
-          <w:lang w:val="en-US" w:eastAsia="zh-CN" w:bidi="hi-IN"/>
-        </w:rPr>
-        <w:t xml:space="preserve"> Be decisive, deliberate, and have strong resolve and determination. If you are moving in a right direction, let your momentum build more momentum. Use the power of your momentum to keep you going. Capitalize on your successes–big and small–to propel you forward towards your objectives. If you falter, do not dwell in that state; recover and keep going stronger, better, faster, smarter.</w:t>
+        <w:t>Accurately assess the importance of your actions. Hone your awarenesses(spatial, situational, etc).??? Before taking any action consider the intended and unintended consequences. Consider everything. Be decisive, deliberate, and have strong resolve and determination. If you are moving in a right direction, let your momentum build more momentum. Use the power of your momentum to keep you going. Capitalize on your successes–big and small–to propel you forward towards your objectives. If you falter, do not dwell in that state; recover and keep going stronger, better, faster, smarter.</w:t>
       </w:r>
     </w:p>
     <w:p>
@@ -1547,7 +1471,6 @@
         <w:rPr>
           <w:rFonts w:ascii="Times New Roman" w:hAnsi="Times New Roman"/>
           <w:b w:val="false"/>
-          <w:b w:val="false"/>
           <w:bCs w:val="false"/>
           <w:color w:val="auto"/>
           <w:sz w:val="24"/>
@@ -1560,7 +1483,7 @@
           <w:rFonts w:ascii="Times New Roman" w:hAnsi="Times New Roman"/>
           <w:b w:val="false"/>
           <w:bCs w:val="false"/>
-          <w:color w:val="000000"/>
+          <w:color w:val="auto"/>
           <w:sz w:val="24"/>
           <w:szCs w:val="24"/>
           <w:shd w:fill="auto" w:val="clear"/>
@@ -1636,7 +1559,6 @@
         <w:rPr>
           <w:rFonts w:ascii="Times New Roman" w:hAnsi="Times New Roman"/>
           <w:b w:val="false"/>
-          <w:b w:val="false"/>
           <w:bCs w:val="false"/>
           <w:color w:val="auto"/>
           <w:sz w:val="24"/>
@@ -1650,7 +1572,7 @@
           <w:rFonts w:ascii="Times New Roman" w:hAnsi="Times New Roman"/>
           <w:b w:val="false"/>
           <w:bCs w:val="false"/>
-          <w:color w:val="000000"/>
+          <w:color w:val="auto"/>
           <w:sz w:val="24"/>
           <w:szCs w:val="24"/>
           <w:u w:val="none"/>
@@ -2107,7 +2029,6 @@
         <w:rPr>
           <w:rFonts w:ascii="Times New Roman" w:hAnsi="Times New Roman"/>
           <w:b w:val="false"/>
-          <w:b w:val="false"/>
           <w:bCs w:val="false"/>
           <w:outline w:val="false"/>
           <w:color w:val="auto"/>
@@ -2125,7 +2046,7 @@
           <w:b w:val="false"/>
           <w:bCs w:val="false"/>
           <w:outline w:val="false"/>
-          <w:color w:val="000000"/>
+          <w:color w:val="auto"/>
           <w:spacing w:val="0"/>
           <w:kern w:val="0"/>
           <w:sz w:val="24"/>
@@ -2343,7 +2264,6 @@
         <w:rPr>
           <w:rFonts w:ascii="Times New Roman" w:hAnsi="Times New Roman"/>
           <w:b w:val="false"/>
-          <w:b w:val="false"/>
           <w:bCs w:val="false"/>
           <w:outline w:val="false"/>
           <w:color w:val="auto"/>
@@ -2361,7 +2281,7 @@
           <w:b w:val="false"/>
           <w:bCs w:val="false"/>
           <w:outline w:val="false"/>
-          <w:color w:val="000000"/>
+          <w:color w:val="auto"/>
           <w:spacing w:val="0"/>
           <w:kern w:val="0"/>
           <w:sz w:val="24"/>
@@ -2473,7 +2393,6 @@
         <w:rPr>
           <w:rFonts w:ascii="Times New Roman" w:hAnsi="Times New Roman"/>
           <w:b w:val="false"/>
-          <w:b w:val="false"/>
           <w:bCs w:val="false"/>
           <w:outline w:val="false"/>
           <w:color w:val="auto"/>
@@ -2491,7 +2410,7 @@
           <w:b w:val="false"/>
           <w:bCs w:val="false"/>
           <w:outline w:val="false"/>
-          <w:color w:val="000000"/>
+          <w:color w:val="auto"/>
           <w:spacing w:val="0"/>
           <w:kern w:val="0"/>
           <w:sz w:val="24"/>
@@ -2710,7 +2629,6 @@
         <w:rPr>
           <w:rFonts w:ascii="Times New Roman" w:hAnsi="Times New Roman"/>
           <w:b w:val="false"/>
-          <w:b w:val="false"/>
           <w:bCs w:val="false"/>
           <w:outline w:val="false"/>
           <w:color w:val="auto"/>
@@ -2728,7 +2646,7 @@
           <w:b w:val="false"/>
           <w:bCs w:val="false"/>
           <w:outline w:val="false"/>
-          <w:color w:val="000000"/>
+          <w:color w:val="auto"/>
           <w:spacing w:val="0"/>
           <w:kern w:val="0"/>
           <w:sz w:val="24"/>
@@ -2807,7 +2725,6 @@
         <w:rPr>
           <w:rFonts w:ascii="Times New Roman" w:hAnsi="Times New Roman"/>
           <w:b w:val="false"/>
-          <w:b w:val="false"/>
           <w:bCs w:val="false"/>
           <w:outline w:val="false"/>
           <w:color w:val="auto"/>
@@ -2825,7 +2742,7 @@
           <w:b w:val="false"/>
           <w:bCs w:val="false"/>
           <w:outline w:val="false"/>
-          <w:color w:val="000000"/>
+          <w:color w:val="auto"/>
           <w:spacing w:val="0"/>
           <w:kern w:val="0"/>
           <w:sz w:val="24"/>
@@ -3043,7 +2960,458 @@
           <w:shd w:fill="auto" w:val="clear"/>
         </w:rPr>
         <w:tab/>
-        <w:t xml:space="preserve">Overcome procrastination and laziness—avoid time-traps, idleness, too much leisure, and meaningless, nonsense, worthless activities. Learn to strategically delay gratification in order to achieve specific objectives. Respect your sleep cycle and schedule. Do </w:t>
+        <w:t>Overcome procrastination and laziness—avoid time-traps, idleness, too much leisure, and meaningless, nonsense, worthless activities. Learn to strategically delay gratification in order to achieve specific objectives. Respect your sleep cycle and schedule. Do homework, laundry, wash dishes, clean, organize, cook, and go shopping as soon as necessary and without hesitation. Give yourself plenty of time to ensure that you always arrive early and prepared for appointments and other commitments—show some respect. Solve your problems when they need to be solved. Identify and seize great opportunities quickly. Prioritize and consider the opportunity cost in everything that you engage in. Specialize and concentrate.</w:t>
+      </w:r>
+    </w:p>
+    <w:p>
+      <w:pPr>
+        <w:pStyle w:val="Normal"/>
+        <w:bidi w:val="0"/>
+        <w:spacing w:lineRule="auto" w:line="276"/>
+        <w:jc w:val="left"/>
+        <w:rPr>
+          <w:rFonts w:ascii="Times New Roman" w:hAnsi="Times New Roman"/>
+          <w:b w:val="false"/>
+          <w:bCs w:val="false"/>
+          <w:color w:val="auto"/>
+          <w:sz w:val="24"/>
+          <w:szCs w:val="24"/>
+          <w:u w:val="none"/>
+          <w:shd w:fill="auto" w:val="clear"/>
+        </w:rPr>
+      </w:pPr>
+      <w:r>
+        <w:rPr>
+          <w:rFonts w:ascii="Times New Roman" w:hAnsi="Times New Roman"/>
+          <w:b w:val="false"/>
+          <w:bCs w:val="false"/>
+          <w:color w:val="auto"/>
+          <w:sz w:val="24"/>
+          <w:szCs w:val="24"/>
+          <w:u w:val="none"/>
+          <w:shd w:fill="auto" w:val="clear"/>
+        </w:rPr>
+      </w:r>
+    </w:p>
+    <w:p>
+      <w:pPr>
+        <w:pStyle w:val="Normal"/>
+        <w:bidi w:val="0"/>
+        <w:spacing w:lineRule="auto" w:line="276"/>
+        <w:jc w:val="center"/>
+        <w:rPr>
+          <w:rFonts w:ascii="Times New Roman" w:hAnsi="Times New Roman"/>
+        </w:rPr>
+      </w:pPr>
+      <w:r>
+        <w:rPr>
+          <w:rFonts w:ascii="Times New Roman" w:hAnsi="Times New Roman"/>
+          <w:b/>
+          <w:bCs/>
+          <w:color w:val="000000"/>
+          <w:sz w:val="24"/>
+          <w:szCs w:val="24"/>
+          <w:u w:val="none"/>
+          <w:shd w:fill="auto" w:val="clear"/>
+        </w:rPr>
+        <w:t>EMOTIONAL</w:t>
+      </w:r>
+    </w:p>
+    <w:p>
+      <w:pPr>
+        <w:pStyle w:val="Normal"/>
+        <w:bidi w:val="0"/>
+        <w:spacing w:lineRule="auto" w:line="276"/>
+        <w:jc w:val="left"/>
+        <w:rPr>
+          <w:rFonts w:ascii="Times New Roman" w:hAnsi="Times New Roman"/>
+        </w:rPr>
+      </w:pPr>
+      <w:r>
+        <w:rPr>
+          <w:rFonts w:ascii="Times New Roman" w:hAnsi="Times New Roman"/>
+          <w:b w:val="false"/>
+          <w:bCs w:val="false"/>
+          <w:color w:val="000000"/>
+          <w:sz w:val="24"/>
+          <w:szCs w:val="24"/>
+          <w:u w:val="none"/>
+          <w:shd w:fill="auto" w:val="clear"/>
+        </w:rPr>
+        <w:tab/>
+        <w:t xml:space="preserve">Love yourself. Focus on you. Be honest with yourself. Remember to smile and laugh. Always believe in yourself—find inspiration, take courage, and transcend. </w:t>
+      </w:r>
+      <w:r>
+        <w:rPr>
+          <w:rFonts w:eastAsia="Songti SC" w:cs="Arial Unicode MS" w:ascii="Times New Roman" w:hAnsi="Times New Roman"/>
+          <w:b w:val="false"/>
+          <w:bCs w:val="false"/>
+          <w:color w:val="000000"/>
+          <w:kern w:val="2"/>
+          <w:sz w:val="24"/>
+          <w:szCs w:val="24"/>
+          <w:u w:val="none"/>
+          <w:shd w:fill="auto" w:val="clear"/>
+          <w:lang w:val="en-US" w:eastAsia="zh-CN" w:bidi="hi-IN"/>
+        </w:rPr>
+        <w:t>Always m</w:t>
+      </w:r>
+      <w:r>
+        <w:rPr>
+          <w:rFonts w:ascii="Times New Roman" w:hAnsi="Times New Roman"/>
+          <w:b w:val="false"/>
+          <w:bCs w:val="false"/>
+          <w:color w:val="000000"/>
+          <w:sz w:val="24"/>
+          <w:szCs w:val="24"/>
+          <w:u w:val="none"/>
+          <w:shd w:fill="auto" w:val="clear"/>
+        </w:rPr>
+        <w:t xml:space="preserve">ake the best out of every situation. </w:t>
+      </w:r>
+      <w:r>
+        <w:rPr>
+          <w:rFonts w:ascii="Times New Roman" w:hAnsi="Times New Roman"/>
+          <w:b w:val="false"/>
+          <w:bCs w:val="false"/>
+          <w:color w:val="000000"/>
+          <w:sz w:val="24"/>
+          <w:szCs w:val="24"/>
+          <w:u w:val="single"/>
+          <w:shd w:fill="81D41A" w:val="clear"/>
+        </w:rPr>
+        <w:t>Stay strong, bold, and serene.</w:t>
+      </w:r>
+      <w:r>
+        <w:rPr>
+          <w:rFonts w:ascii="Times New Roman" w:hAnsi="Times New Roman"/>
+          <w:b w:val="false"/>
+          <w:bCs w:val="false"/>
+          <w:color w:val="000000"/>
+          <w:sz w:val="24"/>
+          <w:szCs w:val="24"/>
+          <w:u w:val="none"/>
+          <w:shd w:fill="auto" w:val="clear"/>
+        </w:rPr>
+        <w:t xml:space="preserve"> Smile inwardly in the face of hate, danger, and adversity. Be an optimistic realist. Practice mood regulation–maintaining temperance and equanimity, managing anxiety, excitement, stress, expectation, direction, speed, drive, motivation, purpose, and perspective. Within reason, embrace discomfort, rejection, and risk. Zero fear, zero excuses.</w:t>
+      </w:r>
+    </w:p>
+    <w:p>
+      <w:pPr>
+        <w:pStyle w:val="Normal"/>
+        <w:bidi w:val="0"/>
+        <w:spacing w:lineRule="auto" w:line="276"/>
+        <w:jc w:val="left"/>
+        <w:rPr>
+          <w:rFonts w:ascii="Times New Roman" w:hAnsi="Times New Roman"/>
+          <w:b w:val="false"/>
+          <w:bCs w:val="false"/>
+          <w:sz w:val="24"/>
+          <w:szCs w:val="24"/>
+          <w:shd w:fill="auto" w:val="clear"/>
+        </w:rPr>
+      </w:pPr>
+      <w:r>
+        <w:rPr>
+          <w:rFonts w:ascii="Times New Roman" w:hAnsi="Times New Roman"/>
+          <w:b w:val="false"/>
+          <w:bCs w:val="false"/>
+          <w:sz w:val="24"/>
+          <w:szCs w:val="24"/>
+          <w:shd w:fill="auto" w:val="clear"/>
+        </w:rPr>
+      </w:r>
+    </w:p>
+    <w:p>
+      <w:pPr>
+        <w:pStyle w:val="Normal"/>
+        <w:bidi w:val="0"/>
+        <w:spacing w:lineRule="auto" w:line="276"/>
+        <w:jc w:val="left"/>
+        <w:rPr>
+          <w:rFonts w:ascii="Times New Roman" w:hAnsi="Times New Roman"/>
+        </w:rPr>
+      </w:pPr>
+      <w:r>
+        <w:rPr>
+          <w:rFonts w:ascii="Times New Roman" w:hAnsi="Times New Roman"/>
+          <w:b w:val="false"/>
+          <w:bCs w:val="false"/>
+          <w:color w:val="000000"/>
+          <w:sz w:val="24"/>
+          <w:szCs w:val="24"/>
+          <w:u w:val="none"/>
+          <w:shd w:fill="auto" w:val="clear"/>
+        </w:rPr>
+        <w:tab/>
+        <w:t xml:space="preserve">When apathy, despair, hopelessness, helplessness, or resignation hit, use your reasoning to jog yourself out of that train of thinking. For example, </w:t>
+      </w:r>
+      <w:r>
+        <w:rPr>
+          <w:rFonts w:ascii="Times New Roman" w:hAnsi="Times New Roman"/>
+          <w:b w:val="false"/>
+          <w:bCs w:val="false"/>
+          <w:color w:val="000000"/>
+          <w:sz w:val="24"/>
+          <w:szCs w:val="24"/>
+          <w:u w:val="none"/>
+          <w:shd w:fill="FFFF00" w:val="clear"/>
+        </w:rPr>
+        <w:t>you may find that harboring a feeling of gratitude for the things you have and the positives of your current situation are a good starting point. Remember the times you were without that which you take for granted today.</w:t>
+      </w:r>
+      <w:r>
+        <w:rPr>
+          <w:rFonts w:ascii="Times New Roman" w:hAnsi="Times New Roman"/>
+          <w:b w:val="false"/>
+          <w:bCs w:val="false"/>
+          <w:color w:val="000000"/>
+          <w:sz w:val="24"/>
+          <w:szCs w:val="24"/>
+          <w:u w:val="none"/>
+          <w:shd w:fill="auto" w:val="clear"/>
+        </w:rPr>
+        <w:t xml:space="preserve"> Also, placing things in perspective, that is, thinking about how the opportunities available to you are more than other people have may help as well. Try to forego thinking about what was or what could have been, the seemingly better opportunities and stations that others have, and the disadvantages that you have. Focus on yourself and measure success in comparison to your immediately preceding lowest self.</w:t>
+      </w:r>
+    </w:p>
+    <w:p>
+      <w:pPr>
+        <w:pStyle w:val="Normal"/>
+        <w:bidi w:val="0"/>
+        <w:spacing w:lineRule="auto" w:line="276"/>
+        <w:jc w:val="left"/>
+        <w:rPr>
+          <w:rFonts w:ascii="Times New Roman" w:hAnsi="Times New Roman"/>
+          <w:b w:val="false"/>
+          <w:bCs w:val="false"/>
+          <w:color w:val="auto"/>
+          <w:sz w:val="24"/>
+          <w:szCs w:val="24"/>
+          <w:u w:val="none"/>
+          <w:shd w:fill="auto" w:val="clear"/>
+        </w:rPr>
+      </w:pPr>
+      <w:r>
+        <w:rPr>
+          <w:rFonts w:ascii="Times New Roman" w:hAnsi="Times New Roman"/>
+          <w:b w:val="false"/>
+          <w:bCs w:val="false"/>
+          <w:color w:val="auto"/>
+          <w:sz w:val="24"/>
+          <w:szCs w:val="24"/>
+          <w:u w:val="none"/>
+          <w:shd w:fill="auto" w:val="clear"/>
+        </w:rPr>
+      </w:r>
+    </w:p>
+    <w:p>
+      <w:pPr>
+        <w:pStyle w:val="Normal"/>
+        <w:bidi w:val="0"/>
+        <w:spacing w:lineRule="auto" w:line="276"/>
+        <w:jc w:val="center"/>
+        <w:rPr>
+          <w:rFonts w:ascii="Times New Roman" w:hAnsi="Times New Roman"/>
+        </w:rPr>
+      </w:pPr>
+      <w:r>
+        <w:rPr>
+          <w:rFonts w:ascii="Times New Roman" w:hAnsi="Times New Roman"/>
+          <w:b/>
+          <w:bCs/>
+          <w:color w:val="000000"/>
+          <w:sz w:val="24"/>
+          <w:szCs w:val="24"/>
+          <w:u w:val="none"/>
+          <w:shd w:fill="auto" w:val="clear"/>
+        </w:rPr>
+        <w:t>MONEY</w:t>
+      </w:r>
+    </w:p>
+    <w:p>
+      <w:pPr>
+        <w:pStyle w:val="Normal"/>
+        <w:bidi w:val="0"/>
+        <w:spacing w:lineRule="auto" w:line="276"/>
+        <w:jc w:val="left"/>
+        <w:rPr>
+          <w:rFonts w:ascii="Times New Roman" w:hAnsi="Times New Roman"/>
+        </w:rPr>
+      </w:pPr>
+      <w:r>
+        <w:rPr>
+          <w:rFonts w:ascii="Times New Roman" w:hAnsi="Times New Roman"/>
+          <w:b w:val="false"/>
+          <w:bCs w:val="false"/>
+          <w:color w:val="000000"/>
+          <w:sz w:val="24"/>
+          <w:szCs w:val="24"/>
+          <w:u w:val="none"/>
+          <w:shd w:fill="auto" w:val="clear"/>
+        </w:rPr>
+        <w:tab/>
+        <w:t>Manage money properly, rationally. Save your money. Make honest money in as many ways as you can productively. Take good care of bank accounts, and build and guard your credit. Create and respect your budget. Practice simple living and inexpensive fun. Spend and shop frugally–find good deals. Buy and consume rationally–avoid waste and overconsumption. Maintain your storehouses properly stocked. Share with others. Be charitable without over-giving. Have an emergency savings fund. Savings are for critical emergencies and investment only–meanwhile they don’t even exist. Avoid eating out and delivery(it’s expensive and mostly unhealthy). Pack meals as much as possible. No Fast Foods—No Junk Foods. Avoid check cashing stores, food delivery, taxi cabs, and other unnecessary luxuries. Take good care of money, things, and belongings, and don’t be a clucker. Learn to strategically delay gratification in order to achieve important specific financial objectives. Pay all bills on time. Guard your money from emotional, careless, wasteful, self-indulgent, destructive spending habits. Minimize non-essential purchases and spending. Get into the habit of always saving something for later.</w:t>
+      </w:r>
+    </w:p>
+    <w:p>
+      <w:pPr>
+        <w:pStyle w:val="Normal"/>
+        <w:bidi w:val="0"/>
+        <w:spacing w:lineRule="auto" w:line="276"/>
+        <w:jc w:val="left"/>
+        <w:rPr>
+          <w:rFonts w:ascii="Times New Roman" w:hAnsi="Times New Roman"/>
+          <w:b w:val="false"/>
+          <w:bCs w:val="false"/>
+          <w:color w:val="auto"/>
+          <w:sz w:val="24"/>
+          <w:szCs w:val="24"/>
+          <w:u w:val="none"/>
+          <w:shd w:fill="auto" w:val="clear"/>
+        </w:rPr>
+      </w:pPr>
+      <w:r>
+        <w:rPr>
+          <w:rFonts w:ascii="Times New Roman" w:hAnsi="Times New Roman"/>
+          <w:b w:val="false"/>
+          <w:bCs w:val="false"/>
+          <w:color w:val="auto"/>
+          <w:sz w:val="24"/>
+          <w:szCs w:val="24"/>
+          <w:u w:val="none"/>
+          <w:shd w:fill="auto" w:val="clear"/>
+        </w:rPr>
+      </w:r>
+    </w:p>
+    <w:p>
+      <w:pPr>
+        <w:pStyle w:val="Normal"/>
+        <w:bidi w:val="0"/>
+        <w:spacing w:lineRule="auto" w:line="276"/>
+        <w:jc w:val="center"/>
+        <w:rPr>
+          <w:rFonts w:ascii="Times New Roman" w:hAnsi="Times New Roman"/>
+        </w:rPr>
+      </w:pPr>
+      <w:r>
+        <w:rPr>
+          <w:rFonts w:ascii="Times New Roman" w:hAnsi="Times New Roman"/>
+          <w:b/>
+          <w:bCs/>
+          <w:color w:val="000000"/>
+          <w:sz w:val="24"/>
+          <w:szCs w:val="24"/>
+          <w:u w:val="none"/>
+          <w:shd w:fill="auto" w:val="clear"/>
+        </w:rPr>
+        <w:t>OPERATIONAL</w:t>
+      </w:r>
+    </w:p>
+    <w:p>
+      <w:pPr>
+        <w:pStyle w:val="Normal"/>
+        <w:bidi w:val="0"/>
+        <w:spacing w:lineRule="auto" w:line="276"/>
+        <w:jc w:val="left"/>
+        <w:rPr>
+          <w:rFonts w:ascii="Times New Roman" w:hAnsi="Times New Roman"/>
+        </w:rPr>
+      </w:pPr>
+      <w:r>
+        <w:rPr>
+          <w:rFonts w:ascii="Times New Roman" w:hAnsi="Times New Roman"/>
+          <w:b w:val="false"/>
+          <w:bCs w:val="false"/>
+          <w:color w:val="000000"/>
+          <w:sz w:val="24"/>
+          <w:szCs w:val="24"/>
+          <w:u w:val="none"/>
+          <w:shd w:fill="auto" w:val="clear"/>
+        </w:rPr>
+        <w:tab/>
+        <w:t>If you are truly–at heart–content with the way your life is going, then strive to protect and advance that direction. If you are not content with the way your life is going, change course. Just get it done. Constantly evaluate and maintain your operational performance. Always be prepared for anything and everything–anticipate the unanticipable. Always stay vigilant–</w:t>
+      </w:r>
+      <w:r>
+        <w:rPr>
+          <w:rFonts w:eastAsia="Songti SC" w:cs="Arial Unicode MS" w:ascii="Times New Roman" w:hAnsi="Times New Roman"/>
+          <w:b w:val="false"/>
+          <w:bCs w:val="false"/>
+          <w:color w:val="000000"/>
+          <w:kern w:val="2"/>
+          <w:sz w:val="24"/>
+          <w:szCs w:val="24"/>
+          <w:u w:val="none"/>
+          <w:shd w:fill="auto" w:val="clear"/>
+          <w:lang w:val="en-US" w:eastAsia="zh-CN" w:bidi="hi-IN"/>
+        </w:rPr>
+        <w:t>o</w:t>
+      </w:r>
+      <w:r>
+        <w:rPr>
+          <w:rFonts w:ascii="Times New Roman" w:hAnsi="Times New Roman"/>
+          <w:b w:val="false"/>
+          <w:bCs w:val="false"/>
+          <w:color w:val="000000"/>
+          <w:sz w:val="24"/>
+          <w:szCs w:val="24"/>
+          <w:u w:val="none"/>
+          <w:shd w:fill="auto" w:val="clear"/>
+        </w:rPr>
+        <w:t>pportunity and emergency can appear unexpectedly and instantly.</w:t>
+      </w:r>
+    </w:p>
+    <w:p>
+      <w:pPr>
+        <w:pStyle w:val="Normal"/>
+        <w:bidi w:val="0"/>
+        <w:spacing w:lineRule="auto" w:line="276"/>
+        <w:jc w:val="left"/>
+        <w:rPr>
+          <w:rFonts w:ascii="Times New Roman" w:hAnsi="Times New Roman"/>
+          <w:b w:val="false"/>
+          <w:bCs w:val="false"/>
+          <w:color w:val="auto"/>
+          <w:sz w:val="24"/>
+          <w:szCs w:val="24"/>
+          <w:u w:val="none"/>
+          <w:shd w:fill="auto" w:val="clear"/>
+        </w:rPr>
+      </w:pPr>
+      <w:r>
+        <w:rPr>
+          <w:rFonts w:ascii="Times New Roman" w:hAnsi="Times New Roman"/>
+          <w:b w:val="false"/>
+          <w:bCs w:val="false"/>
+          <w:color w:val="auto"/>
+          <w:sz w:val="24"/>
+          <w:szCs w:val="24"/>
+          <w:u w:val="none"/>
+          <w:shd w:fill="auto" w:val="clear"/>
+        </w:rPr>
+      </w:r>
+    </w:p>
+    <w:p>
+      <w:pPr>
+        <w:pStyle w:val="Normal"/>
+        <w:bidi w:val="0"/>
+        <w:spacing w:lineRule="auto" w:line="276"/>
+        <w:jc w:val="left"/>
+        <w:rPr>
+          <w:rFonts w:ascii="Times New Roman" w:hAnsi="Times New Roman"/>
+        </w:rPr>
+      </w:pPr>
+      <w:r>
+        <w:rPr>
+          <w:rFonts w:ascii="Times New Roman" w:hAnsi="Times New Roman"/>
+          <w:b w:val="false"/>
+          <w:bCs w:val="false"/>
+          <w:color w:val="000000"/>
+          <w:sz w:val="24"/>
+          <w:szCs w:val="24"/>
+          <w:u w:val="none"/>
+          <w:shd w:fill="auto" w:val="clear"/>
+        </w:rPr>
+        <w:tab/>
+        <w:t xml:space="preserve">Make your organizational and operational devices (plans, schedules, routines, etc.) work in a cohesive, synergistic manner to help you draw closer to the ultimate person you want to become. Visualize the ideal you want to be and change your programming and modus operandi to cause the bringing about of that ideal. Master the morning and evening routines. Use coffee to activate yourself in the mornings and accomplish goals. Always stay clean, nourished, hydrated, prepared, presentable, and smelling good. </w:t>
       </w:r>
       <w:r>
         <w:rPr>
@@ -3059,507 +3427,6 @@
           <w:u w:val="none"/>
           <w:shd w:fill="auto" w:val="clear"/>
         </w:rPr>
-        <w:t xml:space="preserve">homework, </w:t>
-      </w:r>
-      <w:r>
-        <w:rPr>
-          <w:rFonts w:ascii="Times New Roman" w:hAnsi="Times New Roman"/>
-          <w:b w:val="false"/>
-          <w:bCs w:val="false"/>
-          <w:outline w:val="false"/>
-          <w:color w:val="000000"/>
-          <w:spacing w:val="0"/>
-          <w:kern w:val="0"/>
-          <w:sz w:val="24"/>
-          <w:szCs w:val="24"/>
-          <w:u w:val="none"/>
-          <w:shd w:fill="auto" w:val="clear"/>
-        </w:rPr>
-        <w:t>laundry, wash dishes, clean, organize, cook, and go shopping as soon as necessary and without hesitation. Give yourself plenty of time to ensure that you always arrive early and prepared for appointments and other commitments—show some respect. Solve your problems when they need to be solved. Identify and seize great opportunities quickly. Prioritize and consider the opportunity cost in everything that you engage in. Specialize and concentrate.</w:t>
-      </w:r>
-    </w:p>
-    <w:p>
-      <w:pPr>
-        <w:pStyle w:val="Normal"/>
-        <w:bidi w:val="0"/>
-        <w:spacing w:lineRule="auto" w:line="276"/>
-        <w:jc w:val="left"/>
-        <w:rPr>
-          <w:rFonts w:ascii="Times New Roman" w:hAnsi="Times New Roman"/>
-          <w:b w:val="false"/>
-          <w:b w:val="false"/>
-          <w:bCs w:val="false"/>
-          <w:color w:val="auto"/>
-          <w:sz w:val="24"/>
-          <w:szCs w:val="24"/>
-          <w:u w:val="none"/>
-          <w:shd w:fill="auto" w:val="clear"/>
-        </w:rPr>
-      </w:pPr>
-      <w:r>
-        <w:rPr>
-          <w:rFonts w:ascii="Times New Roman" w:hAnsi="Times New Roman"/>
-          <w:b w:val="false"/>
-          <w:bCs w:val="false"/>
-          <w:color w:val="000000"/>
-          <w:sz w:val="24"/>
-          <w:szCs w:val="24"/>
-          <w:u w:val="none"/>
-          <w:shd w:fill="auto" w:val="clear"/>
-        </w:rPr>
-      </w:r>
-    </w:p>
-    <w:p>
-      <w:pPr>
-        <w:pStyle w:val="Normal"/>
-        <w:bidi w:val="0"/>
-        <w:spacing w:lineRule="auto" w:line="276"/>
-        <w:jc w:val="center"/>
-        <w:rPr>
-          <w:rFonts w:ascii="Times New Roman" w:hAnsi="Times New Roman"/>
-        </w:rPr>
-      </w:pPr>
-      <w:r>
-        <w:rPr>
-          <w:rFonts w:ascii="Times New Roman" w:hAnsi="Times New Roman"/>
-          <w:b/>
-          <w:bCs/>
-          <w:color w:val="000000"/>
-          <w:sz w:val="24"/>
-          <w:szCs w:val="24"/>
-          <w:u w:val="none"/>
-          <w:shd w:fill="auto" w:val="clear"/>
-        </w:rPr>
-        <w:t>EMOTIONAL</w:t>
-      </w:r>
-    </w:p>
-    <w:p>
-      <w:pPr>
-        <w:pStyle w:val="Normal"/>
-        <w:bidi w:val="0"/>
-        <w:spacing w:lineRule="auto" w:line="276"/>
-        <w:jc w:val="left"/>
-        <w:rPr>
-          <w:rFonts w:ascii="Times New Roman" w:hAnsi="Times New Roman"/>
-        </w:rPr>
-      </w:pPr>
-      <w:r>
-        <w:rPr>
-          <w:rFonts w:ascii="Times New Roman" w:hAnsi="Times New Roman"/>
-          <w:b w:val="false"/>
-          <w:bCs w:val="false"/>
-          <w:color w:val="000000"/>
-          <w:sz w:val="24"/>
-          <w:szCs w:val="24"/>
-          <w:u w:val="none"/>
-          <w:shd w:fill="auto" w:val="clear"/>
-        </w:rPr>
-        <w:tab/>
-        <w:t xml:space="preserve">Love yourself. Focus on you. Be honest with yourself. Remember to smile and laugh. Always believe in yourself—find inspiration, take courage, and transcend. </w:t>
-      </w:r>
-      <w:r>
-        <w:rPr>
-          <w:rFonts w:eastAsia="Songti SC" w:cs="Arial Unicode MS" w:ascii="Times New Roman" w:hAnsi="Times New Roman"/>
-          <w:b w:val="false"/>
-          <w:bCs w:val="false"/>
-          <w:color w:val="000000"/>
-          <w:kern w:val="2"/>
-          <w:sz w:val="24"/>
-          <w:szCs w:val="24"/>
-          <w:u w:val="none"/>
-          <w:shd w:fill="auto" w:val="clear"/>
-          <w:lang w:val="en-US" w:eastAsia="zh-CN" w:bidi="hi-IN"/>
-        </w:rPr>
-        <w:t>Always m</w:t>
-      </w:r>
-      <w:r>
-        <w:rPr>
-          <w:rFonts w:ascii="Times New Roman" w:hAnsi="Times New Roman"/>
-          <w:b w:val="false"/>
-          <w:bCs w:val="false"/>
-          <w:color w:val="000000"/>
-          <w:sz w:val="24"/>
-          <w:szCs w:val="24"/>
-          <w:u w:val="none"/>
-          <w:shd w:fill="auto" w:val="clear"/>
-        </w:rPr>
-        <w:t xml:space="preserve">ake the best out of every situation. </w:t>
-      </w:r>
-      <w:r>
-        <w:rPr>
-          <w:rFonts w:ascii="Times New Roman" w:hAnsi="Times New Roman"/>
-          <w:b w:val="false"/>
-          <w:bCs w:val="false"/>
-          <w:color w:val="000000"/>
-          <w:sz w:val="24"/>
-          <w:szCs w:val="24"/>
-          <w:u w:val="single"/>
-          <w:shd w:fill="81D41A" w:val="clear"/>
-        </w:rPr>
-        <w:t>Stay strong, bold, and serene.</w:t>
-      </w:r>
-      <w:r>
-        <w:rPr>
-          <w:rFonts w:ascii="Times New Roman" w:hAnsi="Times New Roman"/>
-          <w:b w:val="false"/>
-          <w:bCs w:val="false"/>
-          <w:color w:val="000000"/>
-          <w:sz w:val="24"/>
-          <w:szCs w:val="24"/>
-          <w:u w:val="none"/>
-          <w:shd w:fill="auto" w:val="clear"/>
-        </w:rPr>
-        <w:t xml:space="preserve"> Smile inwardly in the face of hate, danger, and adversity. Be an optimistic realist. Practice mood regulation–maintaining temperance and equanimity, managing anxiety, excitement, stress, expectation, direction, speed, drive, motivation, purpose, and perspective. Within reason, embrace discomfort, rejection, and risk. Zero fear, zero excuses.</w:t>
-      </w:r>
-    </w:p>
-    <w:p>
-      <w:pPr>
-        <w:pStyle w:val="Normal"/>
-        <w:bidi w:val="0"/>
-        <w:spacing w:lineRule="auto" w:line="276"/>
-        <w:jc w:val="left"/>
-        <w:rPr>
-          <w:rFonts w:ascii="Times New Roman" w:hAnsi="Times New Roman"/>
-          <w:b w:val="false"/>
-          <w:b w:val="false"/>
-          <w:bCs w:val="false"/>
-          <w:sz w:val="24"/>
-          <w:szCs w:val="24"/>
-          <w:shd w:fill="auto" w:val="clear"/>
-        </w:rPr>
-      </w:pPr>
-      <w:r>
-        <w:rPr>
-          <w:rFonts w:ascii="Times New Roman" w:hAnsi="Times New Roman"/>
-          <w:b w:val="false"/>
-          <w:bCs w:val="false"/>
-          <w:sz w:val="24"/>
-          <w:szCs w:val="24"/>
-          <w:shd w:fill="auto" w:val="clear"/>
-        </w:rPr>
-      </w:r>
-    </w:p>
-    <w:p>
-      <w:pPr>
-        <w:pStyle w:val="Normal"/>
-        <w:bidi w:val="0"/>
-        <w:spacing w:lineRule="auto" w:line="276"/>
-        <w:jc w:val="left"/>
-        <w:rPr>
-          <w:rFonts w:ascii="Times New Roman" w:hAnsi="Times New Roman"/>
-        </w:rPr>
-      </w:pPr>
-      <w:r>
-        <w:rPr>
-          <w:rFonts w:ascii="Times New Roman" w:hAnsi="Times New Roman"/>
-          <w:b w:val="false"/>
-          <w:bCs w:val="false"/>
-          <w:color w:val="000000"/>
-          <w:sz w:val="24"/>
-          <w:szCs w:val="24"/>
-          <w:u w:val="none"/>
-          <w:shd w:fill="auto" w:val="clear"/>
-        </w:rPr>
-        <w:tab/>
-        <w:t xml:space="preserve">When apathy, despair, hopelessness, helplessness, or resignation hit, use your reasoning to jog yourself out of that train of thinking. For example, </w:t>
-      </w:r>
-      <w:r>
-        <w:rPr>
-          <w:rFonts w:ascii="Times New Roman" w:hAnsi="Times New Roman"/>
-          <w:b w:val="false"/>
-          <w:bCs w:val="false"/>
-          <w:color w:val="000000"/>
-          <w:sz w:val="24"/>
-          <w:szCs w:val="24"/>
-          <w:u w:val="none"/>
-          <w:shd w:fill="FFFF00" w:val="clear"/>
-        </w:rPr>
-        <w:t xml:space="preserve">you may find that harboring a feeling of gratitude for the things you have and the positives of your current situation are a good starting point. </w:t>
-      </w:r>
-      <w:r>
-        <w:rPr>
-          <w:rFonts w:ascii="Times New Roman" w:hAnsi="Times New Roman"/>
-          <w:b w:val="false"/>
-          <w:bCs w:val="false"/>
-          <w:color w:val="000000"/>
-          <w:sz w:val="24"/>
-          <w:szCs w:val="24"/>
-          <w:u w:val="none"/>
-          <w:shd w:fill="FFFF00" w:val="clear"/>
-        </w:rPr>
-        <w:t>Remember the times you were without that which you take for granted today.</w:t>
-      </w:r>
-      <w:r>
-        <w:rPr>
-          <w:rFonts w:ascii="Times New Roman" w:hAnsi="Times New Roman"/>
-          <w:b w:val="false"/>
-          <w:bCs w:val="false"/>
-          <w:color w:val="000000"/>
-          <w:sz w:val="24"/>
-          <w:szCs w:val="24"/>
-          <w:u w:val="none"/>
-          <w:shd w:fill="auto" w:val="clear"/>
-        </w:rPr>
-        <w:t xml:space="preserve"> Also, placing things in perspective, that is, thinking about how the opportunities available to you are more than other people have may help as well. Try to forego thinking about what was or what could have been, the seemingly better opportunities and stations that others have, and the disadvantages that you have. Focus on yourself and measure success in comparison to your immediately preceding lowest self.</w:t>
-      </w:r>
-    </w:p>
-    <w:p>
-      <w:pPr>
-        <w:pStyle w:val="Normal"/>
-        <w:bidi w:val="0"/>
-        <w:spacing w:lineRule="auto" w:line="276"/>
-        <w:jc w:val="left"/>
-        <w:rPr>
-          <w:rFonts w:ascii="Times New Roman" w:hAnsi="Times New Roman"/>
-          <w:b w:val="false"/>
-          <w:b w:val="false"/>
-          <w:bCs w:val="false"/>
-          <w:color w:val="auto"/>
-          <w:sz w:val="24"/>
-          <w:szCs w:val="24"/>
-          <w:u w:val="none"/>
-          <w:shd w:fill="auto" w:val="clear"/>
-        </w:rPr>
-      </w:pPr>
-      <w:r>
-        <w:rPr>
-          <w:rFonts w:ascii="Times New Roman" w:hAnsi="Times New Roman"/>
-          <w:b w:val="false"/>
-          <w:bCs w:val="false"/>
-          <w:color w:val="000000"/>
-          <w:sz w:val="24"/>
-          <w:szCs w:val="24"/>
-          <w:u w:val="none"/>
-          <w:shd w:fill="auto" w:val="clear"/>
-        </w:rPr>
-      </w:r>
-    </w:p>
-    <w:p>
-      <w:pPr>
-        <w:pStyle w:val="Normal"/>
-        <w:bidi w:val="0"/>
-        <w:spacing w:lineRule="auto" w:line="276"/>
-        <w:jc w:val="center"/>
-        <w:rPr>
-          <w:rFonts w:ascii="Times New Roman" w:hAnsi="Times New Roman"/>
-        </w:rPr>
-      </w:pPr>
-      <w:r>
-        <w:rPr>
-          <w:rFonts w:ascii="Times New Roman" w:hAnsi="Times New Roman"/>
-          <w:b/>
-          <w:bCs/>
-          <w:color w:val="000000"/>
-          <w:sz w:val="24"/>
-          <w:szCs w:val="24"/>
-          <w:u w:val="none"/>
-          <w:shd w:fill="auto" w:val="clear"/>
-        </w:rPr>
-        <w:t>MONEY</w:t>
-      </w:r>
-    </w:p>
-    <w:p>
-      <w:pPr>
-        <w:pStyle w:val="Normal"/>
-        <w:bidi w:val="0"/>
-        <w:spacing w:lineRule="auto" w:line="276"/>
-        <w:jc w:val="left"/>
-        <w:rPr>
-          <w:rFonts w:ascii="Times New Roman" w:hAnsi="Times New Roman"/>
-        </w:rPr>
-      </w:pPr>
-      <w:r>
-        <w:rPr>
-          <w:rFonts w:ascii="Times New Roman" w:hAnsi="Times New Roman"/>
-          <w:b w:val="false"/>
-          <w:bCs w:val="false"/>
-          <w:color w:val="000000"/>
-          <w:sz w:val="24"/>
-          <w:szCs w:val="24"/>
-          <w:u w:val="none"/>
-          <w:shd w:fill="auto" w:val="clear"/>
-        </w:rPr>
-        <w:tab/>
-        <w:t>Manage money properly, rationally. Save your money. Make honest money in as many ways as you can productively. Take good care of bank accounts, and build and guard your credit. Create and respect your budget. Practice simple living and inexpensive fun. Spend and shop frugally–find good deals. Buy and consume rationally–avoid waste and overconsumption. Maintain your storehouses properly stocked. Share with others. Be charitable without over-giving. Have an emergency savings fund. Savings are for critical emergencies and investment only–meanwhile they don’t even exist. Avoid eating out and delivery(it’s expensive and mostly unhealthy). Pack meals as much as possible. No Fast Foods—No Junk Foods. Avoid check cashing stores, food delivery, taxi cabs, and other unnecessary luxuries. Take good care of money, things, and belongings, and don’t be a clucker. Learn to strategically delay gratification in order to achieve important specific financial objectives. Pay all bills on time. Guard your money from emotional, careless, wasteful, self-indulgent, destructive spending habits. Minimize non-essential purchases and spending. Get into the habit of always saving something for later.</w:t>
-      </w:r>
-    </w:p>
-    <w:p>
-      <w:pPr>
-        <w:pStyle w:val="Normal"/>
-        <w:bidi w:val="0"/>
-        <w:spacing w:lineRule="auto" w:line="276"/>
-        <w:jc w:val="left"/>
-        <w:rPr>
-          <w:rFonts w:ascii="Times New Roman" w:hAnsi="Times New Roman"/>
-          <w:b w:val="false"/>
-          <w:b w:val="false"/>
-          <w:bCs w:val="false"/>
-          <w:color w:val="auto"/>
-          <w:sz w:val="24"/>
-          <w:szCs w:val="24"/>
-          <w:u w:val="none"/>
-          <w:shd w:fill="auto" w:val="clear"/>
-        </w:rPr>
-      </w:pPr>
-      <w:r>
-        <w:rPr>
-          <w:rFonts w:ascii="Times New Roman" w:hAnsi="Times New Roman"/>
-          <w:b w:val="false"/>
-          <w:bCs w:val="false"/>
-          <w:color w:val="000000"/>
-          <w:sz w:val="24"/>
-          <w:szCs w:val="24"/>
-          <w:u w:val="none"/>
-          <w:shd w:fill="auto" w:val="clear"/>
-        </w:rPr>
-      </w:r>
-    </w:p>
-    <w:p>
-      <w:pPr>
-        <w:pStyle w:val="Normal"/>
-        <w:bidi w:val="0"/>
-        <w:spacing w:lineRule="auto" w:line="276"/>
-        <w:jc w:val="center"/>
-        <w:rPr>
-          <w:rFonts w:ascii="Times New Roman" w:hAnsi="Times New Roman"/>
-        </w:rPr>
-      </w:pPr>
-      <w:r>
-        <w:rPr>
-          <w:rFonts w:ascii="Times New Roman" w:hAnsi="Times New Roman"/>
-          <w:b/>
-          <w:bCs/>
-          <w:color w:val="000000"/>
-          <w:sz w:val="24"/>
-          <w:szCs w:val="24"/>
-          <w:u w:val="none"/>
-          <w:shd w:fill="auto" w:val="clear"/>
-        </w:rPr>
-        <w:t>OPERATIONAL</w:t>
-      </w:r>
-    </w:p>
-    <w:p>
-      <w:pPr>
-        <w:pStyle w:val="Normal"/>
-        <w:bidi w:val="0"/>
-        <w:spacing w:lineRule="auto" w:line="276"/>
-        <w:jc w:val="left"/>
-        <w:rPr>
-          <w:rFonts w:ascii="Times New Roman" w:hAnsi="Times New Roman"/>
-        </w:rPr>
-      </w:pPr>
-      <w:r>
-        <w:rPr>
-          <w:rFonts w:ascii="Times New Roman" w:hAnsi="Times New Roman"/>
-          <w:b w:val="false"/>
-          <w:bCs w:val="false"/>
-          <w:color w:val="000000"/>
-          <w:sz w:val="24"/>
-          <w:szCs w:val="24"/>
-          <w:u w:val="none"/>
-          <w:shd w:fill="auto" w:val="clear"/>
-        </w:rPr>
-        <w:tab/>
-        <w:t>If you are truly–at heart–content with the way your life is going, then strive to protect and advance that direction. If you are not content with the way your life is going, change course. Just get it done. Constantly evaluate and maintain your operational performance. Always be prepared for anything and everything–anticipate the unanticipable. Always stay vigilant–</w:t>
-      </w:r>
-      <w:r>
-        <w:rPr>
-          <w:rFonts w:eastAsia="Songti SC" w:cs="Arial Unicode MS" w:ascii="Times New Roman" w:hAnsi="Times New Roman"/>
-          <w:b w:val="false"/>
-          <w:bCs w:val="false"/>
-          <w:color w:val="000000"/>
-          <w:kern w:val="2"/>
-          <w:sz w:val="24"/>
-          <w:szCs w:val="24"/>
-          <w:u w:val="none"/>
-          <w:shd w:fill="auto" w:val="clear"/>
-          <w:lang w:val="en-US" w:eastAsia="zh-CN" w:bidi="hi-IN"/>
-        </w:rPr>
-        <w:t>o</w:t>
-      </w:r>
-      <w:r>
-        <w:rPr>
-          <w:rFonts w:ascii="Times New Roman" w:hAnsi="Times New Roman"/>
-          <w:b w:val="false"/>
-          <w:bCs w:val="false"/>
-          <w:color w:val="000000"/>
-          <w:sz w:val="24"/>
-          <w:szCs w:val="24"/>
-          <w:u w:val="none"/>
-          <w:shd w:fill="auto" w:val="clear"/>
-        </w:rPr>
-        <w:t>pportunity and emergency can appear unexpectedly and instantly.</w:t>
-      </w:r>
-    </w:p>
-    <w:p>
-      <w:pPr>
-        <w:pStyle w:val="Normal"/>
-        <w:bidi w:val="0"/>
-        <w:spacing w:lineRule="auto" w:line="276"/>
-        <w:jc w:val="left"/>
-        <w:rPr>
-          <w:rFonts w:ascii="Times New Roman" w:hAnsi="Times New Roman"/>
-          <w:b w:val="false"/>
-          <w:b w:val="false"/>
-          <w:bCs w:val="false"/>
-          <w:color w:val="auto"/>
-          <w:sz w:val="24"/>
-          <w:szCs w:val="24"/>
-          <w:u w:val="none"/>
-          <w:shd w:fill="auto" w:val="clear"/>
-        </w:rPr>
-      </w:pPr>
-      <w:r>
-        <w:rPr>
-          <w:rFonts w:ascii="Times New Roman" w:hAnsi="Times New Roman"/>
-          <w:b w:val="false"/>
-          <w:bCs w:val="false"/>
-          <w:color w:val="000000"/>
-          <w:sz w:val="24"/>
-          <w:szCs w:val="24"/>
-          <w:u w:val="none"/>
-          <w:shd w:fill="auto" w:val="clear"/>
-        </w:rPr>
-      </w:r>
-    </w:p>
-    <w:p>
-      <w:pPr>
-        <w:pStyle w:val="Normal"/>
-        <w:bidi w:val="0"/>
-        <w:spacing w:lineRule="auto" w:line="276"/>
-        <w:jc w:val="left"/>
-        <w:rPr>
-          <w:rFonts w:ascii="Times New Roman" w:hAnsi="Times New Roman"/>
-        </w:rPr>
-      </w:pPr>
-      <w:r>
-        <w:rPr>
-          <w:rFonts w:ascii="Times New Roman" w:hAnsi="Times New Roman"/>
-          <w:b w:val="false"/>
-          <w:bCs w:val="false"/>
-          <w:color w:val="000000"/>
-          <w:sz w:val="24"/>
-          <w:szCs w:val="24"/>
-          <w:u w:val="none"/>
-          <w:shd w:fill="auto" w:val="clear"/>
-        </w:rPr>
-        <w:tab/>
-        <w:t xml:space="preserve">Make your organizational and operational devices (plans, schedules, routines, etc.) work in a cohesive, synergistic manner to help you draw closer to the ultimate person you want to become. Visualize the ideal you want to be and change your programming and modus operandi to cause the bringing about of that ideal. Master the morning and evening routines. Use coffee to activate yourself in the mornings and accomplish goals. Always stay clean, nourished, hydrated, prepared, presentable, and smelling good. </w:t>
-      </w:r>
-      <w:r>
-        <w:rPr>
-          <w:rFonts w:ascii="Times New Roman" w:hAnsi="Times New Roman"/>
-          <w:b w:val="false"/>
-          <w:bCs w:val="false"/>
-          <w:outline w:val="false"/>
-          <w:color w:val="000000"/>
-          <w:spacing w:val="0"/>
-          <w:kern w:val="0"/>
-          <w:sz w:val="24"/>
-          <w:szCs w:val="24"/>
-          <w:u w:val="none"/>
-          <w:shd w:fill="auto" w:val="clear"/>
-        </w:rPr>
         <w:t xml:space="preserve">Do what is necessary to hold jobs and housing. </w:t>
       </w:r>
       <w:r>
@@ -3589,7 +3456,6 @@
         <w:rPr>
           <w:rFonts w:ascii="Times New Roman" w:hAnsi="Times New Roman"/>
           <w:b w:val="false"/>
-          <w:b w:val="false"/>
           <w:bCs w:val="false"/>
           <w:color w:val="auto"/>
           <w:sz w:val="24"/>
@@ -3603,7 +3469,7 @@
           <w:rFonts w:ascii="Times New Roman" w:hAnsi="Times New Roman"/>
           <w:b w:val="false"/>
           <w:bCs w:val="false"/>
-          <w:color w:val="000000"/>
+          <w:color w:val="auto"/>
           <w:sz w:val="24"/>
           <w:szCs w:val="24"/>
           <w:u w:val="none"/>
@@ -3645,7 +3511,6 @@
         <w:rPr>
           <w:rFonts w:ascii="Times New Roman" w:hAnsi="Times New Roman"/>
           <w:b w:val="false"/>
-          <w:b w:val="false"/>
           <w:bCs w:val="false"/>
           <w:color w:val="auto"/>
           <w:sz w:val="24"/>
@@ -3659,7 +3524,7 @@
           <w:rFonts w:ascii="Times New Roman" w:hAnsi="Times New Roman"/>
           <w:b w:val="false"/>
           <w:bCs w:val="false"/>
-          <w:color w:val="000000"/>
+          <w:color w:val="auto"/>
           <w:sz w:val="24"/>
           <w:szCs w:val="24"/>
           <w:u w:val="none"/>
@@ -3839,7 +3704,6 @@
         <w:rPr>
           <w:rFonts w:ascii="Times New Roman" w:hAnsi="Times New Roman"/>
           <w:b w:val="false"/>
-          <w:b w:val="false"/>
           <w:bCs w:val="false"/>
           <w:color w:val="auto"/>
           <w:sz w:val="24"/>
@@ -3852,7 +3716,7 @@
           <w:rFonts w:ascii="Times New Roman" w:hAnsi="Times New Roman"/>
           <w:b w:val="false"/>
           <w:bCs w:val="false"/>
-          <w:color w:val="000000"/>
+          <w:color w:val="auto"/>
           <w:sz w:val="24"/>
           <w:szCs w:val="24"/>
           <w:shd w:fill="auto" w:val="clear"/>
@@ -3934,7 +3798,6 @@
         <w:rPr>
           <w:rFonts w:ascii="Times New Roman" w:hAnsi="Times New Roman"/>
           <w:b w:val="false"/>
-          <w:b w:val="false"/>
           <w:bCs w:val="false"/>
           <w:color w:val="auto"/>
           <w:sz w:val="24"/>
@@ -3947,7 +3810,7 @@
           <w:rFonts w:ascii="Times New Roman" w:hAnsi="Times New Roman"/>
           <w:b w:val="false"/>
           <w:bCs w:val="false"/>
-          <w:color w:val="000000"/>
+          <w:color w:val="auto"/>
           <w:sz w:val="24"/>
           <w:szCs w:val="24"/>
           <w:shd w:fill="auto" w:val="clear"/>
@@ -4028,7 +3891,6 @@
         <w:rPr>
           <w:rFonts w:ascii="Times New Roman" w:hAnsi="Times New Roman"/>
           <w:b w:val="false"/>
-          <w:b w:val="false"/>
           <w:bCs w:val="false"/>
           <w:color w:val="auto"/>
           <w:sz w:val="24"/>
@@ -4041,7 +3903,7 @@
           <w:rFonts w:ascii="Times New Roman" w:hAnsi="Times New Roman"/>
           <w:b w:val="false"/>
           <w:bCs w:val="false"/>
-          <w:color w:val="000000"/>
+          <w:color w:val="auto"/>
           <w:sz w:val="24"/>
           <w:szCs w:val="24"/>
           <w:shd w:fill="auto" w:val="clear"/>
@@ -4105,7 +3967,6 @@
         <w:jc w:val="left"/>
         <w:rPr>
           <w:b w:val="false"/>
-          <w:b w:val="false"/>
           <w:bCs w:val="false"/>
           <w:color w:val="000000"/>
           <w:sz w:val="24"/>
@@ -4337,7 +4198,6 @@
         <w:jc w:val="left"/>
         <w:rPr>
           <w:b w:val="false"/>
-          <w:b w:val="false"/>
           <w:bCs w:val="false"/>
           <w:color w:val="000000"/>
           <w:sz w:val="24"/>
@@ -4392,7 +4252,6 @@
         <w:rPr>
           <w:rFonts w:ascii="Times New Roman" w:hAnsi="Times New Roman"/>
           <w:b w:val="false"/>
-          <w:b w:val="false"/>
           <w:bCs w:val="false"/>
           <w:color w:val="auto"/>
           <w:sz w:val="24"/>
@@ -4406,7 +4265,7 @@
           <w:rFonts w:ascii="Times New Roman" w:hAnsi="Times New Roman"/>
           <w:b w:val="false"/>
           <w:bCs w:val="false"/>
-          <w:color w:val="000000"/>
+          <w:color w:val="auto"/>
           <w:sz w:val="24"/>
           <w:szCs w:val="24"/>
           <w:u w:val="none"/>
@@ -4423,7 +4282,6 @@
         <w:rPr>
           <w:rFonts w:ascii="Times New Roman" w:hAnsi="Times New Roman"/>
           <w:b w:val="false"/>
-          <w:b w:val="false"/>
           <w:bCs w:val="false"/>
           <w:color w:val="auto"/>
           <w:sz w:val="24"/>
@@ -4436,7 +4294,7 @@
           <w:rFonts w:ascii="Times New Roman" w:hAnsi="Times New Roman"/>
           <w:b w:val="false"/>
           <w:bCs w:val="false"/>
-          <w:color w:val="000000"/>
+          <w:color w:val="auto"/>
           <w:sz w:val="24"/>
           <w:szCs w:val="24"/>
           <w:shd w:fill="auto" w:val="clear"/>
@@ -4450,7 +4308,7 @@
       <w:pPr>
         <w:pStyle w:val="Normal"/>
         <w:bidi w:val="0"/>
-        <w:spacing w:lineRule="auto" w:line="276"/>
+        <w:spacing w:lineRule="auto" w:line="276" w:before="0" w:after="0"/>
         <w:jc w:val="center"/>
         <w:rPr>
           <w:rFonts w:ascii="Times New Roman" w:hAnsi="Times New Roman"/>
@@ -4523,7 +4381,6 @@
         <w:rPr>
           <w:rFonts w:ascii="Times New Roman" w:hAnsi="Times New Roman" w:eastAsia="Songti SC" w:cs="Arial Unicode MS"/>
           <w:b w:val="false"/>
-          <w:b w:val="false"/>
           <w:bCs w:val="false"/>
           <w:color w:val="000000"/>
           <w:kern w:val="2"/>
@@ -4584,7 +4441,6 @@
         <w:rPr>
           <w:rFonts w:ascii="Times New Roman" w:hAnsi="Times New Roman" w:eastAsia="Songti SC" w:cs="Arial Unicode MS"/>
           <w:b w:val="false"/>
-          <w:b w:val="false"/>
           <w:bCs w:val="false"/>
           <w:color w:val="000000"/>
           <w:kern w:val="2"/>
@@ -4645,7 +4501,6 @@
         <w:rPr>
           <w:rFonts w:ascii="Times New Roman" w:hAnsi="Times New Roman" w:eastAsia="Songti SC" w:cs="Arial Unicode MS"/>
           <w:b w:val="false"/>
-          <w:b w:val="false"/>
           <w:bCs w:val="false"/>
           <w:color w:val="000000"/>
           <w:kern w:val="2"/>
@@ -4706,7 +4561,6 @@
         <w:rPr>
           <w:rFonts w:ascii="Times New Roman" w:hAnsi="Times New Roman" w:eastAsia="Songti SC" w:cs="Arial Unicode MS"/>
           <w:b w:val="false"/>
-          <w:b w:val="false"/>
           <w:bCs w:val="false"/>
           <w:color w:val="000000"/>
           <w:kern w:val="2"/>
@@ -4767,7 +4621,6 @@
         <w:rPr>
           <w:rFonts w:ascii="Times New Roman" w:hAnsi="Times New Roman" w:eastAsia="Songti SC" w:cs="Arial Unicode MS"/>
           <w:b w:val="false"/>
-          <w:b w:val="false"/>
           <w:bCs w:val="false"/>
           <w:color w:val="000000"/>
           <w:kern w:val="2"/>
@@ -4828,7 +4681,6 @@
         <w:rPr>
           <w:rFonts w:ascii="Times New Roman" w:hAnsi="Times New Roman" w:eastAsia="Songti SC" w:cs="Arial Unicode MS"/>
           <w:b w:val="false"/>
-          <w:b w:val="false"/>
           <w:bCs w:val="false"/>
           <w:color w:val="000000"/>
           <w:kern w:val="2"/>
@@ -4862,7 +4714,6 @@
         <w:jc w:val="left"/>
         <w:rPr>
           <w:rFonts w:ascii="Times New Roman" w:hAnsi="Times New Roman" w:eastAsia="Songti SC" w:cs="Arial Unicode MS"/>
-          <w:b w:val="false"/>
           <w:b w:val="false"/>
           <w:bCs w:val="false"/>
           <w:color w:val="000000"/>
@@ -4965,7 +4816,6 @@
         <w:rPr>
           <w:rFonts w:ascii="Times New Roman" w:hAnsi="Times New Roman" w:eastAsia="Songti SC" w:cs="Arial Unicode MS"/>
           <w:b w:val="false"/>
-          <w:b w:val="false"/>
           <w:bCs w:val="false"/>
           <w:color w:val="000000"/>
           <w:kern w:val="2"/>
@@ -5027,7 +4877,6 @@
         <w:rPr>
           <w:rFonts w:ascii="Times New Roman" w:hAnsi="Times New Roman"/>
           <w:b w:val="false"/>
-          <w:b w:val="false"/>
           <w:bCs w:val="false"/>
           <w:color w:val="auto"/>
           <w:sz w:val="24"/>
@@ -5040,7 +4889,7 @@
           <w:rFonts w:ascii="Times New Roman" w:hAnsi="Times New Roman"/>
           <w:b w:val="false"/>
           <w:bCs w:val="false"/>
-          <w:color w:val="000000"/>
+          <w:color w:val="auto"/>
           <w:sz w:val="24"/>
           <w:szCs w:val="24"/>
           <w:shd w:fill="auto" w:val="clear"/>
@@ -5105,7 +4954,6 @@
         <w:rPr>
           <w:rFonts w:ascii="Times New Roman" w:hAnsi="Times New Roman"/>
           <w:b w:val="false"/>
-          <w:b w:val="false"/>
           <w:bCs w:val="false"/>
           <w:color w:val="auto"/>
           <w:sz w:val="24"/>
@@ -5118,7 +4966,7 @@
           <w:rFonts w:ascii="Times New Roman" w:hAnsi="Times New Roman"/>
           <w:b w:val="false"/>
           <w:bCs w:val="false"/>
-          <w:color w:val="000000"/>
+          <w:color w:val="auto"/>
           <w:sz w:val="24"/>
           <w:szCs w:val="24"/>
           <w:shd w:fill="auto" w:val="clear"/>
@@ -5157,7 +5005,6 @@
         <w:rPr>
           <w:rFonts w:ascii="Times New Roman" w:hAnsi="Times New Roman"/>
           <w:b w:val="false"/>
-          <w:b w:val="false"/>
           <w:bCs w:val="false"/>
           <w:sz w:val="24"/>
           <w:szCs w:val="24"/>
@@ -5207,7 +5054,6 @@
         <w:rPr>
           <w:rFonts w:ascii="Times New Roman" w:hAnsi="Times New Roman"/>
           <w:b w:val="false"/>
-          <w:b w:val="false"/>
           <w:bCs w:val="false"/>
           <w:sz w:val="24"/>
           <w:szCs w:val="24"/>
@@ -5257,7 +5103,6 @@
         <w:rPr>
           <w:rFonts w:ascii="Times New Roman" w:hAnsi="Times New Roman"/>
           <w:b w:val="false"/>
-          <w:b w:val="false"/>
           <w:bCs w:val="false"/>
           <w:sz w:val="24"/>
           <w:szCs w:val="24"/>
@@ -5307,7 +5152,6 @@
         <w:rPr>
           <w:rFonts w:ascii="Times New Roman" w:hAnsi="Times New Roman"/>
           <w:b w:val="false"/>
-          <w:b w:val="false"/>
           <w:bCs w:val="false"/>
           <w:sz w:val="24"/>
           <w:szCs w:val="24"/>
@@ -5357,7 +5201,6 @@
         <w:rPr>
           <w:rFonts w:ascii="Times New Roman" w:hAnsi="Times New Roman"/>
           <w:b w:val="false"/>
-          <w:b w:val="false"/>
           <w:bCs w:val="false"/>
           <w:color w:val="auto"/>
           <w:sz w:val="24"/>
@@ -5371,7 +5214,7 @@
           <w:rFonts w:ascii="Times New Roman" w:hAnsi="Times New Roman"/>
           <w:b w:val="false"/>
           <w:bCs w:val="false"/>
-          <w:color w:val="000000"/>
+          <w:color w:val="auto"/>
           <w:sz w:val="24"/>
           <w:szCs w:val="24"/>
           <w:u w:val="none"/>
@@ -5552,7 +5395,6 @@
         <w:rPr>
           <w:rFonts w:ascii="Times New Roman" w:hAnsi="Times New Roman"/>
           <w:b w:val="false"/>
-          <w:b w:val="false"/>
           <w:bCs w:val="false"/>
           <w:color w:val="auto"/>
           <w:sz w:val="24"/>
@@ -5566,7 +5408,7 @@
           <w:rFonts w:ascii="Times New Roman" w:hAnsi="Times New Roman"/>
           <w:b w:val="false"/>
           <w:bCs w:val="false"/>
-          <w:color w:val="000000"/>
+          <w:color w:val="auto"/>
           <w:sz w:val="24"/>
           <w:szCs w:val="24"/>
           <w:u w:val="none"/>
@@ -5607,7 +5449,6 @@
         <w:rPr>
           <w:rFonts w:ascii="Times New Roman" w:hAnsi="Times New Roman"/>
           <w:b w:val="false"/>
-          <w:b w:val="false"/>
           <w:bCs w:val="false"/>
           <w:color w:val="auto"/>
           <w:sz w:val="24"/>
@@ -5621,7 +5462,7 @@
           <w:rFonts w:ascii="Times New Roman" w:hAnsi="Times New Roman"/>
           <w:b w:val="false"/>
           <w:bCs w:val="false"/>
-          <w:color w:val="000000"/>
+          <w:color w:val="auto"/>
           <w:sz w:val="24"/>
           <w:szCs w:val="24"/>
           <w:u w:val="none"/>
@@ -5690,7 +5531,6 @@
         <w:rPr>
           <w:rFonts w:ascii="Times New Roman" w:hAnsi="Times New Roman"/>
           <w:b w:val="false"/>
-          <w:b w:val="false"/>
           <w:bCs w:val="false"/>
           <w:color w:val="auto"/>
           <w:sz w:val="24"/>
@@ -5704,7 +5544,7 @@
           <w:rFonts w:ascii="Times New Roman" w:hAnsi="Times New Roman"/>
           <w:b w:val="false"/>
           <w:bCs w:val="false"/>
-          <w:color w:val="000000"/>
+          <w:color w:val="auto"/>
           <w:sz w:val="24"/>
           <w:szCs w:val="24"/>
           <w:u w:val="none"/>
@@ -5745,7 +5585,6 @@
         <w:rPr>
           <w:rFonts w:ascii="Times New Roman" w:hAnsi="Times New Roman"/>
           <w:b w:val="false"/>
-          <w:b w:val="false"/>
           <w:bCs w:val="false"/>
           <w:color w:val="auto"/>
           <w:sz w:val="24"/>
@@ -5759,7 +5598,7 @@
           <w:rFonts w:ascii="Times New Roman" w:hAnsi="Times New Roman"/>
           <w:b w:val="false"/>
           <w:bCs w:val="false"/>
-          <w:color w:val="000000"/>
+          <w:color w:val="auto"/>
           <w:sz w:val="24"/>
           <w:szCs w:val="24"/>
           <w:u w:val="none"/>
@@ -5803,7 +5642,6 @@
         <w:rPr>
           <w:rFonts w:ascii="Times New Roman" w:hAnsi="Times New Roman"/>
           <w:b w:val="false"/>
-          <w:b w:val="false"/>
           <w:bCs w:val="false"/>
           <w:color w:val="auto"/>
           <w:sz w:val="24"/>
@@ -5817,7 +5655,7 @@
           <w:rFonts w:ascii="Times New Roman" w:hAnsi="Times New Roman"/>
           <w:b w:val="false"/>
           <w:bCs w:val="false"/>
-          <w:color w:val="000000"/>
+          <w:color w:val="auto"/>
           <w:sz w:val="24"/>
           <w:szCs w:val="24"/>
           <w:u w:val="none"/>
@@ -5860,7 +5698,6 @@
         <w:rPr>
           <w:rFonts w:ascii="Times New Roman" w:hAnsi="Times New Roman"/>
           <w:b w:val="false"/>
-          <w:b w:val="false"/>
           <w:bCs w:val="false"/>
           <w:color w:val="auto"/>
           <w:sz w:val="24"/>
@@ -5874,7 +5711,7 @@
           <w:rFonts w:ascii="Times New Roman" w:hAnsi="Times New Roman"/>
           <w:b w:val="false"/>
           <w:bCs w:val="false"/>
-          <w:color w:val="000000"/>
+          <w:color w:val="auto"/>
           <w:sz w:val="24"/>
           <w:szCs w:val="24"/>
           <w:u w:val="none"/>
@@ -6250,7 +6087,6 @@
         <w:rPr>
           <w:rFonts w:ascii="Times New Roman" w:hAnsi="Times New Roman"/>
           <w:b w:val="false"/>
-          <w:b w:val="false"/>
           <w:bCs w:val="false"/>
           <w:color w:val="auto"/>
           <w:sz w:val="24"/>
@@ -6264,36 +6100,36 @@
           <w:rFonts w:ascii="Times New Roman" w:hAnsi="Times New Roman"/>
           <w:b w:val="false"/>
           <w:bCs w:val="false"/>
-          <w:color w:val="000000"/>
-          <w:sz w:val="24"/>
-          <w:szCs w:val="24"/>
-          <w:u w:val="none"/>
-          <w:shd w:fill="auto" w:val="clear"/>
-        </w:rPr>
-      </w:r>
-    </w:p>
-    <w:p>
-      <w:pPr>
-        <w:pStyle w:val="Normal"/>
-        <w:bidi w:val="0"/>
-        <w:spacing w:lineRule="auto" w:line="276"/>
-        <w:jc w:val="left"/>
-        <w:rPr>
-          <w:rFonts w:ascii="Times New Roman" w:hAnsi="Times New Roman"/>
-        </w:rPr>
-      </w:pPr>
-      <w:r>
-        <w:rPr>
-          <w:rFonts w:ascii="Times New Roman" w:hAnsi="Times New Roman"/>
-          <w:b w:val="false"/>
-          <w:bCs w:val="false"/>
-          <w:color w:val="000000"/>
-          <w:sz w:val="24"/>
-          <w:szCs w:val="24"/>
-          <w:u w:val="none"/>
-          <w:shd w:fill="auto" w:val="clear"/>
-        </w:rPr>
-        <w:t xml:space="preserve">A key factor in combatting </w:t>
+          <w:color w:val="auto"/>
+          <w:sz w:val="24"/>
+          <w:szCs w:val="24"/>
+          <w:u w:val="none"/>
+          <w:shd w:fill="auto" w:val="clear"/>
+        </w:rPr>
+      </w:r>
+    </w:p>
+    <w:p>
+      <w:pPr>
+        <w:pStyle w:val="Normal"/>
+        <w:bidi w:val="0"/>
+        <w:spacing w:lineRule="auto" w:line="276"/>
+        <w:jc w:val="left"/>
+        <w:rPr>
+          <w:rFonts w:ascii="Times New Roman" w:hAnsi="Times New Roman"/>
+        </w:rPr>
+      </w:pPr>
+      <w:r>
+        <w:rPr>
+          <w:rFonts w:ascii="Times New Roman" w:hAnsi="Times New Roman"/>
+          <w:b w:val="false"/>
+          <w:bCs w:val="false"/>
+          <w:color w:val="000000"/>
+          <w:sz w:val="24"/>
+          <w:szCs w:val="24"/>
+          <w:u w:val="none"/>
+          <w:shd w:fill="auto" w:val="clear"/>
+        </w:rPr>
+        <w:t xml:space="preserve">A key factor in combating </w:t>
       </w:r>
       <w:r>
         <w:rPr>
@@ -6478,7 +6314,7 @@
           <w:u w:val="none"/>
           <w:shd w:fill="auto" w:val="clear"/>
         </w:rPr>
-        <w:t xml:space="preserve">eventually stop yourself. However, when you suspend morality and judgement altogether, you are in a free fall and the damage that can be done to yourself and others is without limit. Such is the case as in moral disengagement. </w:t>
+        <w:t xml:space="preserve">eventually stop yourself. However, when you suspend morality and judgment altogether, you are in a free fall and the damage that can be done to yourself and others is without limit. Such is the case as in moral disengagement. </w:t>
       </w:r>
       <w:r>
         <w:rPr>
@@ -6562,7 +6398,20 @@
           <w:shd w:fill="FFFF00" w:val="clear"/>
           <w:lang w:val="en-US" w:eastAsia="zh-CN" w:bidi="hi-IN"/>
         </w:rPr>
-        <w:t xml:space="preserve">a shock to the set of all </w:t>
+        <w:t>a shock to the set of all the diverse factors that is keeping you in a wrong state</w:t>
+      </w:r>
+      <w:r>
+        <w:rPr>
+          <w:rFonts w:ascii="Times New Roman" w:hAnsi="Times New Roman"/>
+          <w:b w:val="false"/>
+          <w:bCs w:val="false"/>
+          <w:color w:val="000000"/>
+          <w:sz w:val="24"/>
+          <w:szCs w:val="24"/>
+          <w:u w:val="none"/>
+          <w:shd w:fill="FFFF00" w:val="clear"/>
+        </w:rPr>
+        <w:t xml:space="preserve">. </w:t>
       </w:r>
       <w:r>
         <w:rPr>
@@ -6577,7 +6426,60 @@
           <w:shd w:fill="FFFF00" w:val="clear"/>
           <w:lang w:val="en-US" w:eastAsia="zh-CN" w:bidi="hi-IN"/>
         </w:rPr>
-        <w:t xml:space="preserve">the diverse </w:t>
+        <w:t>If you should find yourself in such a state, recognize the opportunity to u</w:t>
+      </w:r>
+      <w:r>
+        <w:rPr>
+          <w:rFonts w:ascii="Times New Roman" w:hAnsi="Times New Roman"/>
+          <w:b w:val="false"/>
+          <w:bCs w:val="false"/>
+          <w:color w:val="000000"/>
+          <w:sz w:val="24"/>
+          <w:szCs w:val="24"/>
+          <w:u w:val="none"/>
+          <w:shd w:fill="FFFF00" w:val="clear"/>
+        </w:rPr>
+        <w:t>se the kick-out, use it wisely, and capitalize on it.</w:t>
+      </w:r>
+    </w:p>
+    <w:p>
+      <w:pPr>
+        <w:pStyle w:val="Normal"/>
+        <w:bidi w:val="0"/>
+        <w:spacing w:lineRule="auto" w:line="276"/>
+        <w:jc w:val="left"/>
+        <w:rPr>
+          <w:rFonts w:ascii="Times New Roman" w:hAnsi="Times New Roman"/>
+        </w:rPr>
+      </w:pPr>
+      <w:r>
+        <w:rPr>
+          <w:rFonts w:ascii="Times New Roman" w:hAnsi="Times New Roman"/>
+        </w:rPr>
+      </w:r>
+    </w:p>
+    <w:p>
+      <w:pPr>
+        <w:pStyle w:val="Normal"/>
+        <w:bidi w:val="0"/>
+        <w:spacing w:lineRule="auto" w:line="276"/>
+        <w:jc w:val="left"/>
+        <w:rPr>
+          <w:rFonts w:ascii="Times New Roman" w:hAnsi="Times New Roman"/>
+        </w:rPr>
+      </w:pPr>
+      <w:r>
+        <w:rPr>
+          <w:rFonts w:ascii="Times New Roman" w:hAnsi="Times New Roman"/>
+          <w:b w:val="false"/>
+          <w:bCs w:val="false"/>
+          <w:color w:val="000000"/>
+          <w:sz w:val="24"/>
+          <w:szCs w:val="24"/>
+          <w:u w:val="none"/>
+          <w:shd w:fill="auto" w:val="clear"/>
+        </w:rPr>
+        <w:t xml:space="preserve">A tiny amount of faith goes a long way from a self-efficacy standpoint. That is, whether or not something ends up working out in your favor, the belief that it will, can drive you to persevere. And this perseverance will bleed out into other areas of potential </w:t>
       </w:r>
       <w:r>
         <w:rPr>
@@ -6589,105 +6491,9 @@
           <w:sz w:val="24"/>
           <w:szCs w:val="24"/>
           <w:u w:val="none"/>
-          <w:shd w:fill="FFFF00" w:val="clear"/>
+          <w:shd w:fill="auto" w:val="clear"/>
           <w:lang w:val="en-US" w:eastAsia="zh-CN" w:bidi="hi-IN"/>
         </w:rPr>
-        <w:t>factors that is keeping you in a wrong state</w:t>
-      </w:r>
-      <w:r>
-        <w:rPr>
-          <w:rFonts w:ascii="Times New Roman" w:hAnsi="Times New Roman"/>
-          <w:b w:val="false"/>
-          <w:bCs w:val="false"/>
-          <w:color w:val="000000"/>
-          <w:sz w:val="24"/>
-          <w:szCs w:val="24"/>
-          <w:u w:val="none"/>
-          <w:shd w:fill="FFFF00" w:val="clear"/>
-        </w:rPr>
-        <w:t xml:space="preserve">. </w:t>
-      </w:r>
-      <w:r>
-        <w:rPr>
-          <w:rFonts w:eastAsia="Songti SC" w:cs="Arial Unicode MS" w:ascii="Times New Roman" w:hAnsi="Times New Roman"/>
-          <w:b w:val="false"/>
-          <w:bCs w:val="false"/>
-          <w:color w:val="000000"/>
-          <w:kern w:val="2"/>
-          <w:sz w:val="24"/>
-          <w:szCs w:val="24"/>
-          <w:u w:val="none"/>
-          <w:shd w:fill="FFFF00" w:val="clear"/>
-          <w:lang w:val="en-US" w:eastAsia="zh-CN" w:bidi="hi-IN"/>
-        </w:rPr>
-        <w:t>If you should find yourself in such a state, recognize the opportunity to u</w:t>
-      </w:r>
-      <w:r>
-        <w:rPr>
-          <w:rFonts w:ascii="Times New Roman" w:hAnsi="Times New Roman"/>
-          <w:b w:val="false"/>
-          <w:bCs w:val="false"/>
-          <w:color w:val="000000"/>
-          <w:sz w:val="24"/>
-          <w:szCs w:val="24"/>
-          <w:u w:val="none"/>
-          <w:shd w:fill="FFFF00" w:val="clear"/>
-        </w:rPr>
-        <w:t>se the kick-out, use it wisely, and capitalize on it.</w:t>
-      </w:r>
-    </w:p>
-    <w:p>
-      <w:pPr>
-        <w:pStyle w:val="Normal"/>
-        <w:bidi w:val="0"/>
-        <w:spacing w:lineRule="auto" w:line="276"/>
-        <w:jc w:val="left"/>
-        <w:rPr>
-          <w:rFonts w:ascii="Times New Roman" w:hAnsi="Times New Roman"/>
-        </w:rPr>
-      </w:pPr>
-      <w:r>
-        <w:rPr>
-          <w:rFonts w:ascii="Times New Roman" w:hAnsi="Times New Roman"/>
-        </w:rPr>
-      </w:r>
-    </w:p>
-    <w:p>
-      <w:pPr>
-        <w:pStyle w:val="Normal"/>
-        <w:bidi w:val="0"/>
-        <w:spacing w:lineRule="auto" w:line="276"/>
-        <w:jc w:val="left"/>
-        <w:rPr>
-          <w:rFonts w:ascii="Times New Roman" w:hAnsi="Times New Roman"/>
-        </w:rPr>
-      </w:pPr>
-      <w:r>
-        <w:rPr>
-          <w:rFonts w:ascii="Times New Roman" w:hAnsi="Times New Roman"/>
-          <w:b w:val="false"/>
-          <w:bCs w:val="false"/>
-          <w:color w:val="000000"/>
-          <w:sz w:val="24"/>
-          <w:szCs w:val="24"/>
-          <w:u w:val="none"/>
-          <w:shd w:fill="auto" w:val="clear"/>
-        </w:rPr>
-        <w:t xml:space="preserve">A tiny amount of faith goes a long way from a self-efficacy standpoint. That is, whether or not something ends up working out in your favor, the belief that it will, can drive you to persevere. And this perseverance will bleed out into other areas of potential </w:t>
-      </w:r>
-      <w:r>
-        <w:rPr>
-          <w:rFonts w:eastAsia="Songti SC" w:cs="Arial Unicode MS" w:ascii="Times New Roman" w:hAnsi="Times New Roman"/>
-          <w:b w:val="false"/>
-          <w:bCs w:val="false"/>
-          <w:color w:val="000000"/>
-          <w:kern w:val="2"/>
-          <w:sz w:val="24"/>
-          <w:szCs w:val="24"/>
-          <w:u w:val="none"/>
-          <w:shd w:fill="auto" w:val="clear"/>
-          <w:lang w:val="en-US" w:eastAsia="zh-CN" w:bidi="hi-IN"/>
-        </w:rPr>
         <w:t>within</w:t>
       </w:r>
       <w:r>
@@ -6757,6 +6563,335 @@
       <w:r>
         <w:rPr>
           <w:rFonts w:ascii="Times New Roman" w:hAnsi="Times New Roman"/>
+          <w:b w:val="false"/>
+          <w:bCs w:val="false"/>
+          <w:color w:val="000000"/>
+          <w:sz w:val="24"/>
+          <w:szCs w:val="24"/>
+          <w:u w:val="none"/>
+          <w:shd w:fill="auto" w:val="clear"/>
+        </w:rPr>
+      </w:r>
+    </w:p>
+    <w:p>
+      <w:pPr>
+        <w:pStyle w:val="Normal"/>
+        <w:bidi w:val="0"/>
+        <w:spacing w:lineRule="auto" w:line="276"/>
+        <w:jc w:val="left"/>
+        <w:rPr>
+          <w:rFonts w:ascii="Times New Roman" w:hAnsi="Times New Roman"/>
+        </w:rPr>
+      </w:pPr>
+      <w:r>
+        <w:rPr>
+          <w:rFonts w:ascii="Times New Roman" w:hAnsi="Times New Roman"/>
+          <w:b w:val="false"/>
+          <w:bCs w:val="false"/>
+          <w:color w:val="000000"/>
+          <w:sz w:val="24"/>
+          <w:szCs w:val="24"/>
+          <w:u w:val="none"/>
+          <w:shd w:fill="auto" w:val="clear"/>
+        </w:rPr>
+        <w:t>When no one is there to support you, encourage you, soundify you, do so for yourself.</w:t>
+      </w:r>
+    </w:p>
+    <w:p>
+      <w:pPr>
+        <w:pStyle w:val="Normal"/>
+        <w:bidi w:val="0"/>
+        <w:spacing w:lineRule="auto" w:line="276"/>
+        <w:jc w:val="left"/>
+        <w:rPr>
+          <w:rFonts w:ascii="Times New Roman" w:hAnsi="Times New Roman"/>
+        </w:rPr>
+      </w:pPr>
+      <w:r>
+        <w:rPr>
+          <w:rFonts w:ascii="Times New Roman" w:hAnsi="Times New Roman"/>
+          <w:b w:val="false"/>
+          <w:bCs w:val="false"/>
+          <w:color w:val="000000"/>
+          <w:sz w:val="24"/>
+          <w:szCs w:val="24"/>
+          <w:u w:val="none"/>
+          <w:shd w:fill="auto" w:val="clear"/>
+        </w:rPr>
+      </w:r>
+    </w:p>
+    <w:p>
+      <w:pPr>
+        <w:pStyle w:val="Normal"/>
+        <w:bidi w:val="0"/>
+        <w:spacing w:lineRule="auto" w:line="276"/>
+        <w:jc w:val="left"/>
+        <w:rPr>
+          <w:rFonts w:ascii="Times New Roman" w:hAnsi="Times New Roman"/>
+        </w:rPr>
+      </w:pPr>
+      <w:r>
+        <w:rPr>
+          <w:rFonts w:ascii="Times New Roman" w:hAnsi="Times New Roman"/>
+          <w:b w:val="false"/>
+          <w:bCs w:val="false"/>
+          <w:color w:val="000000"/>
+          <w:sz w:val="24"/>
+          <w:szCs w:val="24"/>
+          <w:u w:val="none"/>
+          <w:shd w:fill="auto" w:val="clear"/>
+        </w:rPr>
+        <w:t>Never let anyone force you to fight.</w:t>
+      </w:r>
+    </w:p>
+    <w:p>
+      <w:pPr>
+        <w:pStyle w:val="Normal"/>
+        <w:bidi w:val="0"/>
+        <w:spacing w:lineRule="auto" w:line="276"/>
+        <w:jc w:val="left"/>
+        <w:rPr>
+          <w:rFonts w:ascii="Times New Roman" w:hAnsi="Times New Roman"/>
+        </w:rPr>
+      </w:pPr>
+      <w:r>
+        <w:rPr>
+          <w:rFonts w:ascii="Times New Roman" w:hAnsi="Times New Roman"/>
+          <w:b w:val="false"/>
+          <w:bCs w:val="false"/>
+          <w:color w:val="000000"/>
+          <w:sz w:val="24"/>
+          <w:szCs w:val="24"/>
+          <w:u w:val="none"/>
+          <w:shd w:fill="auto" w:val="clear"/>
+        </w:rPr>
+      </w:r>
+    </w:p>
+    <w:p>
+      <w:pPr>
+        <w:pStyle w:val="Normal"/>
+        <w:bidi w:val="0"/>
+        <w:spacing w:lineRule="auto" w:line="276"/>
+        <w:jc w:val="left"/>
+        <w:rPr>
+          <w:rFonts w:ascii="Times New Roman" w:hAnsi="Times New Roman"/>
+        </w:rPr>
+      </w:pPr>
+      <w:r>
+        <w:rPr>
+          <w:rFonts w:ascii="Times New Roman" w:hAnsi="Times New Roman"/>
+          <w:b w:val="false"/>
+          <w:bCs w:val="false"/>
+          <w:color w:val="000000"/>
+          <w:sz w:val="24"/>
+          <w:szCs w:val="24"/>
+          <w:u w:val="none"/>
+          <w:shd w:fill="auto" w:val="clear"/>
+        </w:rPr>
+        <w:t>Some people aren’t worth working for. Some jobs aren’t worth doing. Some people aren’t worth being with. Some things aren’t worth your time.</w:t>
+      </w:r>
+    </w:p>
+    <w:p>
+      <w:pPr>
+        <w:pStyle w:val="Normal"/>
+        <w:bidi w:val="0"/>
+        <w:spacing w:lineRule="auto" w:line="276"/>
+        <w:jc w:val="left"/>
+        <w:rPr>
+          <w:rFonts w:ascii="Times New Roman" w:hAnsi="Times New Roman"/>
+        </w:rPr>
+      </w:pPr>
+      <w:r>
+        <w:rPr>
+          <w:rFonts w:ascii="Times New Roman" w:hAnsi="Times New Roman"/>
+          <w:b w:val="false"/>
+          <w:bCs w:val="false"/>
+          <w:color w:val="000000"/>
+          <w:sz w:val="24"/>
+          <w:szCs w:val="24"/>
+          <w:u w:val="none"/>
+          <w:shd w:fill="auto" w:val="clear"/>
+        </w:rPr>
+      </w:r>
+    </w:p>
+    <w:p>
+      <w:pPr>
+        <w:pStyle w:val="Normal"/>
+        <w:bidi w:val="0"/>
+        <w:spacing w:lineRule="auto" w:line="276"/>
+        <w:jc w:val="left"/>
+        <w:rPr>
+          <w:rFonts w:ascii="Times New Roman" w:hAnsi="Times New Roman"/>
+        </w:rPr>
+      </w:pPr>
+      <w:r>
+        <w:rPr>
+          <w:rFonts w:ascii="Times New Roman" w:hAnsi="Times New Roman"/>
+          <w:b w:val="false"/>
+          <w:bCs w:val="false"/>
+          <w:color w:val="000000"/>
+          <w:sz w:val="24"/>
+          <w:szCs w:val="24"/>
+          <w:u w:val="none"/>
+          <w:shd w:fill="auto" w:val="clear"/>
+        </w:rPr>
+        <w:t>Avoid fake solutions to your problems.</w:t>
+      </w:r>
+    </w:p>
+    <w:p>
+      <w:pPr>
+        <w:pStyle w:val="Normal"/>
+        <w:bidi w:val="0"/>
+        <w:spacing w:lineRule="auto" w:line="276"/>
+        <w:jc w:val="left"/>
+        <w:rPr>
+          <w:rFonts w:ascii="Times New Roman" w:hAnsi="Times New Roman"/>
+        </w:rPr>
+      </w:pPr>
+      <w:r>
+        <w:rPr>
+          <w:rFonts w:ascii="Times New Roman" w:hAnsi="Times New Roman"/>
+          <w:b w:val="false"/>
+          <w:bCs w:val="false"/>
+          <w:color w:val="000000"/>
+          <w:sz w:val="24"/>
+          <w:szCs w:val="24"/>
+          <w:u w:val="none"/>
+          <w:shd w:fill="auto" w:val="clear"/>
+        </w:rPr>
+      </w:r>
+    </w:p>
+    <w:p>
+      <w:pPr>
+        <w:pStyle w:val="Normal"/>
+        <w:bidi w:val="0"/>
+        <w:spacing w:lineRule="auto" w:line="276"/>
+        <w:jc w:val="left"/>
+        <w:rPr>
+          <w:rFonts w:ascii="Times New Roman" w:hAnsi="Times New Roman"/>
+        </w:rPr>
+      </w:pPr>
+      <w:r>
+        <w:rPr>
+          <w:rFonts w:ascii="Times New Roman" w:hAnsi="Times New Roman"/>
+          <w:b w:val="false"/>
+          <w:bCs w:val="false"/>
+          <w:color w:val="000000"/>
+          <w:sz w:val="24"/>
+          <w:szCs w:val="24"/>
+          <w:u w:val="none"/>
+          <w:shd w:fill="auto" w:val="clear"/>
+        </w:rPr>
+        <w:t>When perturbed or irate, seek to find more perspectives.</w:t>
+      </w:r>
+    </w:p>
+    <w:p>
+      <w:pPr>
+        <w:pStyle w:val="Normal"/>
+        <w:bidi w:val="0"/>
+        <w:spacing w:lineRule="auto" w:line="276"/>
+        <w:jc w:val="left"/>
+        <w:rPr>
+          <w:rFonts w:ascii="Times New Roman" w:hAnsi="Times New Roman"/>
+        </w:rPr>
+      </w:pPr>
+      <w:r>
+        <w:rPr>
+          <w:rFonts w:ascii="Times New Roman" w:hAnsi="Times New Roman"/>
+          <w:b w:val="false"/>
+          <w:bCs w:val="false"/>
+          <w:color w:val="000000"/>
+          <w:sz w:val="24"/>
+          <w:szCs w:val="24"/>
+          <w:u w:val="none"/>
+          <w:shd w:fill="auto" w:val="clear"/>
+        </w:rPr>
+      </w:r>
+    </w:p>
+    <w:p>
+      <w:pPr>
+        <w:pStyle w:val="Normal"/>
+        <w:bidi w:val="0"/>
+        <w:spacing w:lineRule="auto" w:line="276"/>
+        <w:jc w:val="left"/>
+        <w:rPr>
+          <w:rFonts w:ascii="Times New Roman" w:hAnsi="Times New Roman"/>
+        </w:rPr>
+      </w:pPr>
+      <w:r>
+        <w:rPr>
+          <w:rFonts w:ascii="Times New Roman" w:hAnsi="Times New Roman"/>
+          <w:b w:val="false"/>
+          <w:bCs w:val="false"/>
+          <w:color w:val="000000"/>
+          <w:sz w:val="24"/>
+          <w:szCs w:val="24"/>
+          <w:u w:val="none"/>
+          <w:shd w:fill="auto" w:val="clear"/>
+        </w:rPr>
+        <w:t>Be extremely selective of your friends. Your life can be ruined beyond repair, even by no fault of your own, because of your friends.</w:t>
+      </w:r>
+    </w:p>
+    <w:p>
+      <w:pPr>
+        <w:pStyle w:val="Normal"/>
+        <w:bidi w:val="0"/>
+        <w:spacing w:lineRule="auto" w:line="276"/>
+        <w:jc w:val="left"/>
+        <w:rPr>
+          <w:rFonts w:ascii="Times New Roman" w:hAnsi="Times New Roman"/>
+        </w:rPr>
+      </w:pPr>
+      <w:r>
+        <w:rPr>
+          <w:rFonts w:ascii="Times New Roman" w:hAnsi="Times New Roman"/>
+          <w:b w:val="false"/>
+          <w:bCs w:val="false"/>
+          <w:color w:val="000000"/>
+          <w:sz w:val="24"/>
+          <w:szCs w:val="24"/>
+          <w:u w:val="none"/>
+          <w:shd w:fill="auto" w:val="clear"/>
+        </w:rPr>
+      </w:r>
+    </w:p>
+    <w:p>
+      <w:pPr>
+        <w:pStyle w:val="Normal"/>
+        <w:bidi w:val="0"/>
+        <w:spacing w:lineRule="auto" w:line="276"/>
+        <w:jc w:val="left"/>
+        <w:rPr>
+          <w:rFonts w:ascii="Times New Roman" w:hAnsi="Times New Roman"/>
+        </w:rPr>
+      </w:pPr>
+      <w:r>
+        <w:rPr>
+          <w:rFonts w:ascii="Times New Roman" w:hAnsi="Times New Roman"/>
+          <w:b w:val="false"/>
+          <w:bCs w:val="false"/>
+          <w:color w:val="000000"/>
+          <w:sz w:val="24"/>
+          <w:szCs w:val="24"/>
+          <w:u w:val="none"/>
+          <w:shd w:fill="auto" w:val="clear"/>
+        </w:rPr>
+        <w:t>Do not measure success based on others, but rather based on your own fulfillment and state and your contributions to the improvement of others’ states.</w:t>
+      </w:r>
+    </w:p>
+    <w:p>
+      <w:pPr>
+        <w:pStyle w:val="Normal"/>
+        <w:bidi w:val="0"/>
+        <w:spacing w:lineRule="auto" w:line="276"/>
+        <w:jc w:val="left"/>
+        <w:rPr>
+          <w:rFonts w:ascii="Times New Roman" w:hAnsi="Times New Roman"/>
+        </w:rPr>
+      </w:pPr>
+      <w:r>
+        <w:rPr>
+          <w:rFonts w:ascii="Times New Roman" w:hAnsi="Times New Roman"/>
         </w:rPr>
       </w:r>
     </w:p>
@@ -6881,7 +7016,6 @@
         <w:rPr>
           <w:rFonts w:ascii="Times New Roman" w:hAnsi="Times New Roman"/>
           <w:b w:val="false"/>
-          <w:b w:val="false"/>
           <w:bCs w:val="false"/>
           <w:color w:val="auto"/>
           <w:sz w:val="24"/>
@@ -6894,7 +7028,7 @@
           <w:rFonts w:ascii="Times New Roman" w:hAnsi="Times New Roman"/>
           <w:b w:val="false"/>
           <w:bCs w:val="false"/>
-          <w:color w:val="000000"/>
+          <w:color w:val="auto"/>
           <w:sz w:val="24"/>
           <w:szCs w:val="24"/>
           <w:shd w:fill="auto" w:val="clear"/>
@@ -6908,7 +7042,7 @@
       <w:pPr>
         <w:pStyle w:val="Normal"/>
         <w:bidi w:val="0"/>
-        <w:spacing w:lineRule="auto" w:line="276"/>
+        <w:spacing w:lineRule="auto" w:line="276" w:before="0" w:after="0"/>
         <w:jc w:val="center"/>
         <w:rPr>
           <w:rFonts w:ascii="Times New Roman" w:hAnsi="Times New Roman"/>
@@ -6937,7 +7071,6 @@
         <w:rPr>
           <w:rFonts w:ascii="Times New Roman" w:hAnsi="Times New Roman"/>
           <w:b w:val="false"/>
-          <w:b w:val="false"/>
           <w:bCs w:val="false"/>
           <w:color w:val="auto"/>
           <w:sz w:val="24"/>
@@ -6951,7 +7084,7 @@
           <w:rFonts w:ascii="Times New Roman" w:hAnsi="Times New Roman"/>
           <w:b w:val="false"/>
           <w:bCs w:val="false"/>
-          <w:color w:val="000000"/>
+          <w:color w:val="auto"/>
           <w:sz w:val="24"/>
           <w:szCs w:val="24"/>
           <w:u w:val="none"/>
@@ -19313,7 +19446,6 @@
         <w:rPr>
           <w:rFonts w:ascii="Times New Roman" w:hAnsi="Times New Roman"/>
           <w:b w:val="false"/>
-          <w:b w:val="false"/>
           <w:bCs w:val="false"/>
           <w:color w:val="auto"/>
           <w:sz w:val="24"/>
@@ -19327,7 +19459,7 @@
           <w:rFonts w:ascii="Times New Roman" w:hAnsi="Times New Roman"/>
           <w:b w:val="false"/>
           <w:bCs w:val="false"/>
-          <w:color w:val="000000"/>
+          <w:color w:val="auto"/>
           <w:sz w:val="24"/>
           <w:szCs w:val="24"/>
           <w:u w:val="none"/>
@@ -19342,7 +19474,7 @@
       <w:pPr>
         <w:pStyle w:val="Normal"/>
         <w:bidi w:val="0"/>
-        <w:spacing w:lineRule="auto" w:line="276"/>
+        <w:spacing w:lineRule="auto" w:line="276" w:before="0" w:after="0"/>
         <w:jc w:val="center"/>
         <w:rPr>
           <w:rFonts w:ascii="Times New Roman" w:hAnsi="Times New Roman"/>
@@ -21133,13 +21265,15 @@
         </w:rPr>
       </w:pPr>
       <w:r>
-        <w:rPr/>
+        <w:rPr>
+          <w:rFonts w:ascii="Times New Roman" w:hAnsi="Times New Roman"/>
+        </w:rPr>
       </w:r>
     </w:p>
     <w:sectPr>
       <w:type w:val="nextPage"/>
       <w:pgSz w:w="12240" w:h="15840"/>
-      <w:pgMar w:left="1134" w:right="1134" w:header="0" w:top="1134" w:footer="0" w:bottom="1134" w:gutter="0"/>
+      <w:pgMar w:left="1134" w:right="1134" w:gutter="0" w:header="0" w:top="1134" w:footer="0" w:bottom="1134"/>
       <w:pgNumType w:fmt="decimal"/>
       <w:formProt w:val="false"/>
       <w:textDirection w:val="lrTb"/>
@@ -21194,8 +21328,8 @@
       <w:bCs/>
     </w:rPr>
   </w:style>
-  <w:style w:type="character" w:styleId="Bullets">
-    <w:name w:val="Bullets"/>
+  <w:style w:type="character" w:styleId="Bulletsuser">
+    <w:name w:val="Bullets (user)"/>
     <w:qFormat/>
     <w:rPr>
       <w:rFonts w:ascii="OpenSymbol" w:hAnsi="OpenSymbol" w:eastAsia="OpenSymbol" w:cs="OpenSymbol"/>
@@ -21204,7 +21338,7 @@
   <w:style w:type="paragraph" w:styleId="Heading">
     <w:name w:val="Heading"/>
     <w:basedOn w:val="Normal"/>
-    <w:next w:val="TextBody"/>
+    <w:next w:val="BodyText"/>
     <w:qFormat/>
     <w:pPr>
       <w:keepNext w:val="true"/>
@@ -21216,7 +21350,7 @@
       <w:szCs w:val="28"/>
     </w:rPr>
   </w:style>
-  <w:style w:type="paragraph" w:styleId="TextBody">
+  <w:style w:type="paragraph" w:styleId="BodyText">
     <w:name w:val="Body Text"/>
     <w:basedOn w:val="Normal"/>
     <w:pPr>
@@ -21226,14 +21360,14 @@
   </w:style>
   <w:style w:type="paragraph" w:styleId="List">
     <w:name w:val="List"/>
-    <w:basedOn w:val="TextBody"/>
+    <w:basedOn w:val="BodyText"/>
     <w:pPr/>
     <w:rPr>
       <w:rFonts w:cs="Arial Unicode MS"/>
     </w:rPr>
   </w:style>
   <w:style w:type="paragraph" w:styleId="Caption">
-    <w:name w:val="Caption"/>
+    <w:name w:val="caption"/>
     <w:basedOn w:val="Normal"/>
     <w:qFormat/>
     <w:pPr>
@@ -21283,4 +21417,110 @@
     </w:rPr>
   </w:style>
 </w:styles>
+</file>
+
+<file path=word/theme/theme1.xml><?xml version="1.0" encoding="utf-8"?>
+<a:theme xmlns:a="http://schemas.openxmlformats.org/drawingml/2006/main" xmlns:r="http://schemas.openxmlformats.org/officeDocument/2006/relationships" name="Office">
+  <a:themeElements>
+    <a:clrScheme name="LibreOffice">
+      <a:dk1>
+        <a:srgbClr val="000000"/>
+      </a:dk1>
+      <a:lt1>
+        <a:srgbClr val="FFFFFF"/>
+      </a:lt1>
+      <a:dk2>
+        <a:srgbClr val="000000"/>
+      </a:dk2>
+      <a:lt2>
+        <a:srgbClr val="FFFFFF"/>
+      </a:lt2>
+      <a:accent1>
+        <a:srgbClr val="18A303"/>
+      </a:accent1>
+      <a:accent2>
+        <a:srgbClr val="0369A3"/>
+      </a:accent2>
+      <a:accent3>
+        <a:srgbClr val="A33E03"/>
+      </a:accent3>
+      <a:accent4>
+        <a:srgbClr val="8E03A3"/>
+      </a:accent4>
+      <a:accent5>
+        <a:srgbClr val="C99C00"/>
+      </a:accent5>
+      <a:accent6>
+        <a:srgbClr val="C9211E"/>
+      </a:accent6>
+      <a:hlink>
+        <a:srgbClr val="0000EE"/>
+      </a:hlink>
+      <a:folHlink>
+        <a:srgbClr val="551A8B"/>
+      </a:folHlink>
+    </a:clrScheme>
+    <a:fontScheme name="Office">
+      <a:majorFont>
+        <a:latin typeface="Arial" pitchFamily="0" charset="1"/>
+        <a:ea typeface="DejaVu Sans" pitchFamily="0" charset="1"/>
+        <a:cs typeface="DejaVu Sans" pitchFamily="0" charset="1"/>
+      </a:majorFont>
+      <a:minorFont>
+        <a:latin typeface="Arial" pitchFamily="0" charset="1"/>
+        <a:ea typeface="DejaVu Sans" pitchFamily="0" charset="1"/>
+        <a:cs typeface="DejaVu Sans" pitchFamily="0" charset="1"/>
+      </a:minorFont>
+    </a:fontScheme>
+    <a:fmtScheme>
+      <a:fillStyleLst>
+        <a:solidFill>
+          <a:schemeClr val="phClr"/>
+        </a:solidFill>
+        <a:solidFill>
+          <a:schemeClr val="phClr"/>
+        </a:solidFill>
+        <a:solidFill>
+          <a:schemeClr val="phClr"/>
+        </a:solidFill>
+      </a:fillStyleLst>
+      <a:lnStyleLst>
+        <a:ln w="6350" cap="flat" cmpd="sng" algn="ctr">
+          <a:prstDash val="solid"/>
+          <a:miter/>
+        </a:ln>
+        <a:ln w="6350" cap="flat" cmpd="sng" algn="ctr">
+          <a:prstDash val="solid"/>
+          <a:miter/>
+        </a:ln>
+        <a:ln w="6350" cap="flat" cmpd="sng" algn="ctr">
+          <a:prstDash val="solid"/>
+          <a:miter/>
+        </a:ln>
+      </a:lnStyleLst>
+      <a:effectStyleLst>
+        <a:effectStyle>
+          <a:effectLst/>
+        </a:effectStyle>
+        <a:effectStyle>
+          <a:effectLst/>
+        </a:effectStyle>
+        <a:effectStyle>
+          <a:effectLst/>
+        </a:effectStyle>
+      </a:effectStyleLst>
+      <a:bgFillStyleLst>
+        <a:solidFill>
+          <a:schemeClr val="phClr"/>
+        </a:solidFill>
+        <a:solidFill>
+          <a:schemeClr val="phClr"/>
+        </a:solidFill>
+        <a:solidFill>
+          <a:schemeClr val="phClr"/>
+        </a:solidFill>
+      </a:bgFillStyleLst>
+    </a:fmtScheme>
+  </a:themeElements>
+</a:theme>
 </file>
</xml_diff>